<commit_message>
Still at it bitchesssss I am a GOD (lol)
</commit_message>
<xml_diff>
--- a/BMO Voice Engine/personaplex/report bitch/CMP511-Report (AutoRecovered).docx
+++ b/BMO Voice Engine/personaplex/report bitch/CMP511-Report (AutoRecovered).docx
@@ -30,7 +30,13 @@
     </w:p>
     <w:p>
       <w:r>
-        <w:t xml:space="preserve">The deployment of real-time, full-duplex speech-to-speech foundation models on edge devices is severely constrained by memory limitations. This Type A primary research project investigates the deployment of a 7-billion parameter Moshi-family architecture on an NVIDIA Jetson Orin Nano 8GB, a hardware platform enforcing a strict 5.5 GB unified memory ceiling. To bridge the gap between the 16.7 GB BF16 baseline model and the physical hardware limits, a custom four-tier Salient Efficient Post-Training Quantization (SEPTQ) scheme was implemented. The system dynamically assigns FP16, INT8, INT4, and INT2 precision to model weights based on Hessian-weighted saliency scores. Experimental findings revealed a strict architectural boundary: the </w:t>
+        <w:t xml:space="preserve">The deployment of real-time, full-duplex speech-to-speech foundation models on edge devices is severely constrained by memory limitations. This Type A primary research project investigates the deployment of a 7-billion parameter Moshi-family architecture on an NVIDIA Jetson Orin Nano 8GB, a hardware platform enforcing a strict 5.5 GB unified memory ceiling. To bridge the gap between the 16.7 GB BF16 baseline model and the physical hardware limits, a custom four-tier </w:t>
+      </w:r>
+      <w:r>
+        <w:t>Simple</w:t>
+      </w:r>
+      <w:r>
+        <w:t xml:space="preserve"> Efficient Post-Training Quantization (SEPTQ) scheme was implemented. The system dynamically assigns FP16, INT8, INT4, and INT2 precision to model weights based on Hessian-weighted saliency scores. Experimental findings revealed a strict architectural boundary: the </w:t>
       </w:r>
       <m:oMath>
         <m:r>
@@ -97,15 +103,13 @@
     </w:p>
     <w:p>
       <w:r>
-        <w:t xml:space="preserve">The evolution of intelligent agents from asynchronous, cloud-tethered text generators to physically embodied, real-time conversational companions </w:t>
-      </w:r>
-      <w:proofErr w:type="gramStart"/>
-      <w:r>
-        <w:t>demands</w:t>
-      </w:r>
-      <w:proofErr w:type="gramEnd"/>
-      <w:r>
-        <w:t xml:space="preserve"> a fundamental reimagining of neural network architecture and post-training compression </w:t>
+        <w:t xml:space="preserve">The evolution of intelligent agents from asynchronous, </w:t>
+      </w:r>
+      <w:r>
+        <w:t xml:space="preserve">cloud based </w:t>
+      </w:r>
+      <w:r>
+        <w:t xml:space="preserve">text generators to physically embodied, real-time conversational companions demands a fundamental reimagining of neural network architecture and post-training compression </w:t>
       </w:r>
       <w:sdt>
         <w:sdtPr>
@@ -202,36 +206,6 @@
     <w:p>
       <w:r>
         <w:t>Speech-to-speech architectures, conversely, operate directly within a continuous acoustic representation space, facilitating full-duplex communication characterized by overlapping speech, autonomous backchanneling, and latency metrics that rival human cognitive processing speeds. Yet, deploying such massive continuous-space models onto localized edge hardware imposes extreme physical boundaries.</w:t>
-      </w:r>
-    </w:p>
-    <w:p>
-      <w:r>
-        <w:t>The central challenge</w:t>
-      </w:r>
-      <w:r>
-        <w:t xml:space="preserve"> </w:t>
-      </w:r>
-      <w:r>
-        <w:t>and the primary problem statement of this research</w:t>
-      </w:r>
-      <w:r>
-        <w:t xml:space="preserve"> </w:t>
-      </w:r>
-      <w:proofErr w:type="gramStart"/>
-      <w:r>
-        <w:t>lies</w:t>
-      </w:r>
-      <w:proofErr w:type="gramEnd"/>
-      <w:r>
-        <w:t xml:space="preserve"> in the mathematical and systemic gap between the baseline state-of-the-art speech model and the physical constraints of the deployment hardware. The foundational model, a fine-tuned v5_step1500 checkpoint utilizing BF16 precision, possesses a memory footprint of 16.7 GB. The target platform, an NVIDIA Jetson Orin Nano 8GB operating under a severe 25W "Super Mode" thermal envelope, enforces a strict 5.5 GB usable unified memory ceiling. Standard compression methodologies (such as INT4 weight-only quantization, NF4, AWQ, and </w:t>
-      </w:r>
-      <w:proofErr w:type="spellStart"/>
-      <w:r>
-        <w:t>SliceGPT</w:t>
-      </w:r>
-      <w:proofErr w:type="spellEnd"/>
-      <w:r>
-        <w:t>) proved inadequate for this specific architecture, suffering from severe geometric degradation due to massive 40x to 66x continuous acoustic activation outliers.</w:t>
       </w:r>
     </w:p>
     <w:p>
@@ -324,6 +298,60 @@
       </w:r>
     </w:p>
     <w:p>
+      <w:r>
+        <w:t xml:space="preserve">The 5.5 GB figure reflects NVIDIA's published worst-case usable budget for the 8 GB Orin Nano in 25 W Super Mode after factoring in OS, firmware, CUDA driver, and codec overhead. In practice the effective ceiling is somewhat higher (~6.5–7 GB) under tuned OS conditions, which is why the 7.69 GB GGUF artefact loads and executes despite exceeding the worst-case figure at the cost of paging-induced latency (the 800 ms / </w:t>
+      </w:r>
+      <w:r>
+        <w:t>frame</w:t>
+      </w:r>
+      <w:r>
+        <w:t xml:space="preserve"> measurement reported in Performance Analysis is consistent with the runtime spilling cold weight pages to disk during decode).</w:t>
+      </w:r>
+    </w:p>
+    <w:p>
+      <w:pPr>
+        <w:pStyle w:val="Heading2"/>
+      </w:pPr>
+      <w:r>
+        <w:t>Problem Statement</w:t>
+      </w:r>
+    </w:p>
+    <w:p>
+      <w:r>
+        <w:t>The central challenge</w:t>
+      </w:r>
+      <w:r>
+        <w:t xml:space="preserve"> </w:t>
+      </w:r>
+      <w:r>
+        <w:t>and the primary problem statement of this research</w:t>
+      </w:r>
+      <w:r>
+        <w:t xml:space="preserve"> </w:t>
+      </w:r>
+      <w:r>
+        <w:t>lie</w:t>
+      </w:r>
+      <w:r>
+        <w:t xml:space="preserve"> in the mathematical and systemic gap between the baseline state-of-the-art speech model and the physical constraints of the deployment hardware. The foundational model, a fine-tuned </w:t>
+      </w:r>
+      <m:oMath>
+        <m:r>
+          <w:rPr>
+            <w:rFonts w:ascii="Cambria Math" w:hAnsi="Cambria Math"/>
+          </w:rPr>
+          <m:t>v5_step1500</m:t>
+        </m:r>
+      </m:oMath>
+      <w:r>
+        <w:t xml:space="preserve"> checkpoint utilizing BF16 precision, possesses a memory footprint of 16.7 GB. The target platform, an NVIDIA Jetson Orin Nano 8GB operating under a severe 25W "Super Mode" thermal envelope, enforces a strict 5.5 GB usable unified memory ceiling. Standard compression methodologies (such as INT4 weight-only quantization, NF4, AWQ, and SliceGPT) proved inadequate for this </w:t>
+      </w:r>
+      <w:r>
+        <w:lastRenderedPageBreak/>
+        <w:t>specific architecture, suffering from severe geometric degradation due to massive 40x to 66x continuous acoustic activation outliers.</w:t>
+      </w:r>
+    </w:p>
+    <w:p>
       <w:pPr>
         <w:rPr>
           <w:rFonts w:eastAsiaTheme="minorEastAsia"/>
@@ -382,11 +410,16 @@
           <w:b/>
           <w:bCs/>
         </w:rPr>
-        <w:lastRenderedPageBreak/>
         <w:t>Dataset Engineering:</w:t>
       </w:r>
       <w:r>
-        <w:t xml:space="preserve"> The rigorous curation of a 968-clip character voice dataset, mathematically isolated through advanced neural separation and speaker verification architectures.</w:t>
+        <w:t xml:space="preserve"> The rigorous curation of a </w:t>
+      </w:r>
+      <w:r>
+        <w:t>971</w:t>
+      </w:r>
+      <w:r>
+        <w:t>-clip character voice dataset, mathematically isolated through advanced neural separation and speaker verification architectures.</w:t>
       </w:r>
     </w:p>
     <w:p>
@@ -406,15 +439,14 @@
       <w:r>
         <w:t xml:space="preserve"> The bespoke implementation of a multi-tier SEPTQ compression methodology upon a Moshi-family continuous speech model, leading to the empirical discovery of the </w:t>
       </w:r>
-      <w:proofErr w:type="spellStart"/>
-      <w:r>
-        <w:rPr>
-          <w:i/>
-          <w:iCs/>
-        </w:rPr>
-        <w:t>out_proj</w:t>
-      </w:r>
-      <w:proofErr w:type="spellEnd"/>
+      <m:oMath>
+        <m:r>
+          <w:rPr>
+            <w:rFonts w:ascii="Cambria Math" w:hAnsi="Cambria Math"/>
+          </w:rPr>
+          <m:t>out_proj</m:t>
+        </m:r>
+      </m:oMath>
       <w:r>
         <w:t xml:space="preserve"> precision floor.</w:t>
       </w:r>
@@ -437,18 +469,41 @@
         <w:t xml:space="preserve"> The introduction of the </w:t>
       </w:r>
       <m:oMath>
+        <m:sSub>
+          <m:sSubPr>
+            <m:ctrlPr>
+              <w:rPr>
+                <w:rFonts w:ascii="Cambria Math" w:hAnsi="Cambria Math"/>
+                <w:i/>
+              </w:rPr>
+            </m:ctrlPr>
+          </m:sSubPr>
+          <m:e>
+            <m:r>
+              <w:rPr>
+                <w:rFonts w:ascii="Cambria Math" w:hAnsi="Cambria Math"/>
+              </w:rPr>
+              <m:t>z</m:t>
+            </m:r>
+          </m:e>
+          <m:sub>
+            <m:r>
+              <w:rPr>
+                <w:rFonts w:ascii="Cambria Math" w:hAnsi="Cambria Math"/>
+              </w:rPr>
+              <m:t>s</m:t>
+            </m:r>
+          </m:sub>
+        </m:sSub>
         <m:r>
-          <m:rPr>
-            <m:sty m:val="p"/>
-          </m:rPr>
           <w:rPr>
             <w:rFonts w:ascii="Cambria Math" w:hAnsi="Cambria Math"/>
           </w:rPr>
-          <m:t>Z_S</m:t>
+          <m:t xml:space="preserve"> </m:t>
         </m:r>
       </m:oMath>
       <w:r>
-        <w:t xml:space="preserve"> drift metric as a novel, highly sensitive layer-by-layer evaluation tool designed specifically to measure compounding autoregressive error in continuous acoustic environments where standard textual perplexity metrics fail.</w:t>
+        <w:t>drift metric as a novel, highly sensitive layer-by-layer evaluation tool designed specifically to measure compounding autoregressive error in continuous acoustic environments where standard textual perplexity metrics fail.</w:t>
       </w:r>
     </w:p>
     <w:p>
@@ -461,7 +516,25 @@
     </w:p>
     <w:p>
       <w:r>
-        <w:t>The realization of edge-deployed conversational agents necessitates a critical synthesis of multiple theoretical domains, bridging continuous speech modelling, voice identity adaptation, post-training quantization, and unified memory architectures. The following critical evaluation draws upon the foundational literature to contextualize the engineering decisions executed throughout the project.</w:t>
+        <w:t xml:space="preserve">The realization of edge-deployed conversational agents </w:t>
+      </w:r>
+      <w:r>
+        <w:t>requires</w:t>
+      </w:r>
+      <w:r>
+        <w:t xml:space="preserve"> a critical </w:t>
+      </w:r>
+      <w:r>
+        <w:t xml:space="preserve">analysis </w:t>
+      </w:r>
+      <w:r>
+        <w:t>of multiple</w:t>
+      </w:r>
+      <w:r>
+        <w:t xml:space="preserve"> theoretical domains</w:t>
+      </w:r>
+      <w:r>
+        <w:t>, bridging continuous speech modelling, voice identity adaptation, post-training quantization, and unified memory architectures. The following critical evaluation draws upon the foundational literature to contextualize the decisions executed throughout the project.</w:t>
       </w:r>
     </w:p>
     <w:p>
@@ -515,34 +588,11 @@
     </w:p>
     <w:p>
       <w:r>
-        <w:t>Voice identity adaptation within continuous models requires mechanisms that bypass catastrophic forgetting. Traditional Low-Rank Adaptation (</w:t>
-      </w:r>
-      <w:proofErr w:type="spellStart"/>
-      <w:r>
-        <w:t>LoRA</w:t>
-      </w:r>
-      <w:proofErr w:type="spellEnd"/>
-      <w:r>
-        <w:t xml:space="preserve">) introduces trainable rank-decomposition matrices into the transformer layers, which, while effective for text, struggles to holistically capture acoustic prosody without degrading underlying conversational logic. The </w:t>
-      </w:r>
-      <w:proofErr w:type="spellStart"/>
-      <w:r>
-        <w:t>PersonaPlex</w:t>
-      </w:r>
-      <w:proofErr w:type="spellEnd"/>
-      <w:r>
-        <w:t xml:space="preserve"> framework </w:t>
-      </w:r>
-      <w:r>
-        <w:t xml:space="preserve">which is built upon the </w:t>
-      </w:r>
-      <w:proofErr w:type="spellStart"/>
-      <w:r>
-        <w:t>moshi</w:t>
-      </w:r>
-      <w:proofErr w:type="spellEnd"/>
-      <w:r>
-        <w:t xml:space="preserve"> framework </w:t>
+        <w:lastRenderedPageBreak/>
+        <w:t xml:space="preserve">Voice identity adaptation within continuous models requires mechanisms that bypass catastrophic forgetting. Traditional Low-Rank Adaptation (LoRA) introduces trainable rank-decomposition matrices into the transformer layers, which, while effective for text, struggles to holistically capture acoustic prosody without degrading underlying conversational logic. The PersonaPlex framework </w:t>
+      </w:r>
+      <w:r>
+        <w:t xml:space="preserve">which is built upon the moshi framework </w:t>
       </w:r>
       <w:r>
         <w:t>addresses this through a Hybrid System Prompt mechanism, seamlessly concatenating a textual role description with a direct audio voice prompt</w:t>
@@ -589,16 +639,10 @@
         <w:t xml:space="preserve">. </w:t>
       </w:r>
       <w:r>
-        <w:t xml:space="preserve">More critically, </w:t>
-      </w:r>
-      <w:proofErr w:type="spellStart"/>
-      <w:r>
-        <w:lastRenderedPageBreak/>
-        <w:t>PersonaPlex</w:t>
-      </w:r>
-      <w:proofErr w:type="spellEnd"/>
-      <w:r>
-        <w:t xml:space="preserve"> exhibits advanced conversational priors because it was extensively pre-trained on 1,217 hours of the Fisher English conversational dataset. This specific telephonic corpus pre-training embeds sophisticated backchanneling, confusion handling, and duplex communication instincts directly into the base weights, providing out-of-the-box conversational realism that base models severely </w:t>
+        <w:t xml:space="preserve">More critically, PersonaPlex exhibits advanced conversational priors because it was extensively pre-trained on 1,217 hours of the Fisher English conversational dataset. This specific telephonic corpus pre-training embeds sophisticated backchanneling, confusion handling, and duplex communication instincts directly into the base weights, providing out-of-the-box conversational realism that base models severely </w:t>
+      </w:r>
+      <w:r>
+        <w:t xml:space="preserve">lack </w:t>
       </w:r>
       <w:sdt>
         <w:sdtPr>
@@ -751,15 +795,7 @@
     </w:p>
     <w:p>
       <w:r>
-        <w:t xml:space="preserve">Structural pruning methodologies offer an alternative to precision reduction. </w:t>
-      </w:r>
-      <w:proofErr w:type="spellStart"/>
-      <w:r>
-        <w:t>SliceGPT</w:t>
-      </w:r>
-      <w:proofErr w:type="spellEnd"/>
-      <w:r>
-        <w:t xml:space="preserve"> proposes a computational invariance approach, attempting to mathematically delete structurally redundant hidden dimensions by computing a global covariance matrix </w:t>
+        <w:t xml:space="preserve">Structural pruning methodologies offer an alternative to precision reduction. SliceGPT proposes a computational invariance approach, attempting to mathematically delete structurally redundant hidden dimensions by computing a global covariance matrix </w:t>
       </w:r>
       <w:sdt>
         <w:sdtPr>
@@ -796,7 +832,11 @@
     </w:p>
     <w:p>
       <w:r>
-        <w:t xml:space="preserve">Finally, the deployment of large models on edge devices introduces unique challenges associated with unified memory architectures. On the NVIDIA Jetson Orin Nano, the Central Processing Unit (CPU) and the Graphics Processing Unit (GPU) share a single physical RAM pool. The general problem of deploying multi-billion parameter models in these environments revolves around avoiding OS-level page faults and swap-space thrashing, which immediately destroy real-time latency budgets </w:t>
+        <w:t xml:space="preserve">Finally, the deployment of large models on edge devices introduces unique challenges associated with unified memory architectures. On the NVIDIA Jetson Orin </w:t>
+      </w:r>
+      <w:r>
+        <w:lastRenderedPageBreak/>
+        <w:t xml:space="preserve">Nano, the Central Processing Unit (CPU) and the Graphics Processing Unit (GPU) share a single physical RAM pool. The general problem of deploying multi-billion parameter models in these environments revolves around avoiding OS-level page faults and swap-space thrashing, which immediately destroy real-time latency budgets </w:t>
       </w:r>
       <w:sdt>
         <w:sdtPr>
@@ -836,7 +876,6 @@
         <w:pStyle w:val="Heading1"/>
       </w:pPr>
       <w:r>
-        <w:lastRenderedPageBreak/>
         <w:t>Methodology</w:t>
       </w:r>
     </w:p>
@@ -886,15 +925,7 @@
     </w:p>
     <w:p>
       <w:r>
-        <w:t>To isolate target vocalizations from complex cinematic backgrounds, standard source separation was deemed inadequate. The pipeline utilized the BS-</w:t>
-      </w:r>
-      <w:proofErr w:type="spellStart"/>
-      <w:r>
-        <w:t>Roformer</w:t>
-      </w:r>
-      <w:proofErr w:type="spellEnd"/>
-      <w:r>
-        <w:t xml:space="preserve"> neural network, explicitly deploying the </w:t>
+        <w:t xml:space="preserve">To isolate target vocalizations from complex cinematic backgrounds, standard source separation was deemed inadequate. The pipeline utilized the BS-Roformer neural network, explicitly deploying the </w:t>
       </w:r>
       <m:oMath>
         <m:r>
@@ -950,15 +981,7 @@
     </w:p>
     <w:p>
       <w:r>
-        <w:t xml:space="preserve">Initial temporal alignment employing the </w:t>
-      </w:r>
-      <w:proofErr w:type="spellStart"/>
-      <w:r>
-        <w:t>WhisperX</w:t>
-      </w:r>
-      <w:proofErr w:type="spellEnd"/>
-      <w:r>
-        <w:t xml:space="preserve"> model (INT8 precision) failed to generate discrete word-level timestamps, producing anomalous monolithic </w:t>
+        <w:t xml:space="preserve">Initial temporal alignment employing the WhisperX model (INT8 precision) failed to generate discrete word-level timestamps, producing anomalous monolithic </w:t>
       </w:r>
       <m:oMath>
         <m:r>
@@ -1026,15 +1049,7 @@
         <w:t>S</w:t>
       </w:r>
       <w:r>
-        <w:t xml:space="preserve">peaker verification was managed utilizing the </w:t>
-      </w:r>
-      <w:proofErr w:type="spellStart"/>
-      <w:r>
-        <w:t>SpeechBrain</w:t>
-      </w:r>
-      <w:proofErr w:type="spellEnd"/>
-      <w:r>
-        <w:t xml:space="preserve"> ECAPA-TDNN model. Audio arrays were resampled to 16,000 Hz to generate high-dimensional voice embeddings, which were compared via cosine similarity against a pristine reference centroid (</w:t>
+        <w:t>peaker verification was managed utilizing the SpeechBrain ECAPA-TDNN model. Audio arrays were resampled to 16,000 Hz to generate high-dimensional voice embeddings, which were compared via cosine similarity against a pristine reference centroid (</w:t>
       </w:r>
       <m:oMath>
         <m:r>
@@ -1045,7 +1060,11 @@
         </m:r>
       </m:oMath>
       <w:r>
-        <w:t xml:space="preserve">). The pipeline enforced a strict 0.50 cosine threshold, admitting only segments measuring between 1.0 and 12.0 seconds. During data interleaving, a structural incompatibility known as the stereo-doubling bug was identified: the interleaver incorrectly flattened stereo audio into the codebook dimension, producing </w:t>
+        <w:t xml:space="preserve">). The pipeline enforced a strict 0.50 cosine threshold, admitting only segments measuring between 1.0 and 12.0 seconds. During data interleaving, a structural incompatibility known as the stereo-doubling bug was identified: the interleaver incorrectly flattened stereo audio into the codebook </w:t>
+      </w:r>
+      <w:r>
+        <w:lastRenderedPageBreak/>
+        <w:t xml:space="preserve">dimension, producing </w:t>
       </w:r>
       <m:oMath>
         <m:r>
@@ -1118,11 +1137,7 @@
         </w:sdtContent>
       </w:sdt>
       <w:r>
-        <w:t xml:space="preserve">. Candidate embeddings were </w:t>
-      </w:r>
-      <w:r>
-        <w:lastRenderedPageBreak/>
-        <w:t xml:space="preserve">extracted at 48,000 Hz and L2-normalized. The pipeline implemented a tiered triage system evaluating dot products against category centroids, enforcing a </w:t>
+        <w:t xml:space="preserve">. Candidate embeddings were extracted at 48,000 Hz and L2-normalized. The pipeline implemented a tiered triage system evaluating dot products against category centroids, enforcing a </w:t>
       </w:r>
       <m:oMath>
         <m:r>
@@ -1135,11 +1150,9 @@
       <w:r>
         <w:t xml:space="preserve"> threshold for automatic acceptance. Finally, these tags were translated into quantitative five-dimensional AppraisalVectors (Valence, Arousal, Control, Novelty, Obstruct) for tone </w:t>
       </w:r>
-      <w:proofErr w:type="spellStart"/>
-      <w:r>
-        <w:t>labeling</w:t>
-      </w:r>
-      <w:proofErr w:type="spellEnd"/>
+      <w:r>
+        <w:t>labelling</w:t>
+      </w:r>
       <w:r>
         <w:t>.</w:t>
       </w:r>
@@ -1235,23 +1248,13 @@
         <w:t xml:space="preserve"> </w:t>
       </w:r>
       <w:r>
-        <w:t xml:space="preserve">Data Processing Pipeline: A flowchart showing the sequential stages from raw episode files through vocal separation, transcription, speaker verification, stereo-doubling fix, CLAP non-verbal refinement, and </w:t>
-      </w:r>
-      <w:proofErr w:type="spellStart"/>
-      <w:r>
-        <w:t>AppraisalVector</w:t>
-      </w:r>
-      <w:proofErr w:type="spellEnd"/>
-      <w:r>
-        <w:t xml:space="preserve"> </w:t>
-      </w:r>
-      <w:proofErr w:type="spellStart"/>
-      <w:r>
-        <w:t>labeling</w:t>
-      </w:r>
-      <w:proofErr w:type="spellEnd"/>
-      <w:r>
-        <w:t xml:space="preserve"> to the final 968-clip</w:t>
+        <w:t xml:space="preserve">Data Processing Pipeline: A flowchart showing the sequential stages from raw episode files through vocal separation, transcription, speaker verification, stereo-doubling fix, CLAP non-verbal refinement, and AppraisalVector labeling to the final </w:t>
+      </w:r>
+      <w:r>
+        <w:t>971</w:t>
+      </w:r>
+      <w:r>
+        <w:t>-clip</w:t>
       </w:r>
     </w:p>
     <w:p/>
@@ -1268,42 +1271,10 @@
         <w:t>I</w:t>
       </w:r>
       <w:r>
-        <w:t>nitial Low-Rank Adaptation (</w:t>
-      </w:r>
-      <w:proofErr w:type="spellStart"/>
-      <w:r>
-        <w:t>LoRA</w:t>
-      </w:r>
-      <w:proofErr w:type="spellEnd"/>
-      <w:r>
-        <w:t>) fine-tuning runs (v1 through v5) successfully achieved an acceptable training loss of 3.26 and captured the target acoustic timbre.</w:t>
-      </w:r>
-      <w:r>
-        <w:t xml:space="preserve"> It should be noted that the initial </w:t>
-      </w:r>
-      <w:proofErr w:type="spellStart"/>
-      <w:r>
-        <w:t>LoRA</w:t>
-      </w:r>
-      <w:proofErr w:type="spellEnd"/>
-      <w:r>
-        <w:t xml:space="preserve"> were done on the base </w:t>
-      </w:r>
-      <w:proofErr w:type="spellStart"/>
-      <w:r>
-        <w:t>moshi</w:t>
-      </w:r>
-      <w:proofErr w:type="spellEnd"/>
-      <w:r>
-        <w:t xml:space="preserve"> model not the </w:t>
-      </w:r>
-      <w:proofErr w:type="spellStart"/>
-      <w:r>
-        <w:t>personaplex</w:t>
-      </w:r>
-      <w:proofErr w:type="spellEnd"/>
-      <w:r>
-        <w:t xml:space="preserve"> model.</w:t>
+        <w:t>nitial Low-Rank Adaptation (LoRA) fine-tuning runs (v1 through v5) successfully achieved an acceptable training loss of 3.26 and captured the target acoustic timbre.</w:t>
+      </w:r>
+      <w:r>
+        <w:t xml:space="preserve"> It should be noted that the initial LoRA were done on the base moshi model not the personaplex model.</w:t>
       </w:r>
       <w:r>
         <w:t xml:space="preserve"> However, the resulting model functioned purely as a passive speech synthesizer lacking conversational intelligence</w:t>
@@ -1317,13 +1288,12 @@
         </w:rPr>
         <w:t xml:space="preserve"> </w:t>
       </w:r>
-      <w:proofErr w:type="gramStart"/>
-      <w:r>
-        <w:t>In</w:t>
-      </w:r>
-      <w:proofErr w:type="gramEnd"/>
-      <w:r>
-        <w:t xml:space="preserve"> hindsight, this limitation was likely attributable to the quality and structure of the training data. Extracting vocal performance data from a cartoon television series introduced significant constraints, as the longest uninterrupted dialogue segments rarely exceeded 10 seconds. Consequently, the dataset consisted primarily of short, fragmented speech clips with limited textual and conversational context. This caused the temporal transformer to overfit to brief utterance patterns and intermittent silence, rather than learning the longer-span conversational dynamics necessary for coherent interactive dialogue generation.</w:t>
+      <w:r>
+        <w:t xml:space="preserve">In hindsight, this limitation was likely attributable to the quality and structure of the training data. Extracting vocal performance data from a cartoon television series introduced significant constraints, as the longest uninterrupted dialogue segments rarely exceeded 10 seconds. Consequently, the dataset consisted primarily of short, fragmented speech clips with limited textual and conversational context. This caused the temporal </w:t>
+      </w:r>
+      <w:r>
+        <w:lastRenderedPageBreak/>
+        <w:t>transformer to overfit to brief utterance patterns and intermittent silence, rather than learning the longer-span conversational dynamics necessary for coherent interactive dialogue generation.</w:t>
       </w:r>
       <w:r>
         <w:t xml:space="preserve"> </w:t>
@@ -1331,26 +1301,10 @@
     </w:p>
     <w:p>
       <w:r>
-        <w:t xml:space="preserve">Consequently, the architecture was pivoted to leverage NVIDIA's </w:t>
-      </w:r>
-      <w:proofErr w:type="spellStart"/>
-      <w:r>
-        <w:t>PersonaPlex</w:t>
-      </w:r>
-      <w:proofErr w:type="spellEnd"/>
-      <w:r>
-        <w:t xml:space="preserve"> framework (specifically Nvidia/personaplex-7b-v1), which </w:t>
-      </w:r>
-      <w:r>
-        <w:t xml:space="preserve">uses the base </w:t>
-      </w:r>
-      <w:proofErr w:type="spellStart"/>
-      <w:r>
-        <w:t>moshi</w:t>
-      </w:r>
-      <w:proofErr w:type="spellEnd"/>
-      <w:r>
-        <w:t xml:space="preserve"> model and further trains it on </w:t>
+        <w:t xml:space="preserve">Consequently, the architecture was pivoted to leverage NVIDIA's PersonaPlex framework (specifically Nvidia/personaplex-7b-v1), which </w:t>
+      </w:r>
+      <w:r>
+        <w:t xml:space="preserve">uses the base moshi model and further trains it on </w:t>
       </w:r>
       <w:r>
         <w:t xml:space="preserve">1,217 hours of the Fisher English conversational dataset </w:t>
@@ -1388,11 +1342,7 @@
         <w:t>behaviours</w:t>
       </w:r>
       <w:r>
-        <w:t xml:space="preserve"> </w:t>
-      </w:r>
-      <w:r>
-        <w:lastRenderedPageBreak/>
-        <w:t xml:space="preserve">(autonomous confusion handling, turn-taking, </w:t>
+        <w:t xml:space="preserve"> (autonomous confusion handling, turn-taking, </w:t>
       </w:r>
       <w:r>
         <w:t xml:space="preserve">backchannelling, </w:t>
@@ -1404,15 +1354,7 @@
         <w:t xml:space="preserve">this time </w:t>
       </w:r>
       <w:r>
-        <w:t xml:space="preserve">all subsequent </w:t>
-      </w:r>
-      <w:proofErr w:type="spellStart"/>
-      <w:r>
-        <w:t>LoRA</w:t>
-      </w:r>
-      <w:proofErr w:type="spellEnd"/>
-      <w:r>
-        <w:t xml:space="preserve"> fine-tuning was explicitly restricted to the Depth Transformer. This isolated voice identity adaptation from the profound conversational logic embedded within the Temporal Transformer.</w:t>
+        <w:t>all subsequent LoRA fine-tuning was explicitly restricted to the Depth Transformer. This isolated voice identity adaptation from the profound conversational logic embedded within the Temporal Transformer.</w:t>
       </w:r>
     </w:p>
     <w:p>
@@ -1543,7 +1485,21 @@
         <w:t xml:space="preserve">, </w:t>
       </w:r>
       <w:r>
-        <w:t xml:space="preserve">a failure to execute the required Hybrid System Prompt initialization sequence (voice prompt encoding, silence padding, text prompt encoding). This left the Key-Value (KV) cache completely empty and ungrounded. The pipeline was rebuilt utilizing native offline.py logic to correctly ground the KV cache, establishing the </w:t>
+        <w:t xml:space="preserve">a failure to execute the required Hybrid System Prompt initialization sequence (voice prompt encoding, silence padding, text prompt encoding). This left the Key-Value (KV) cache completely empty and ungrounded. </w:t>
+      </w:r>
+      <w:r>
+        <w:t xml:space="preserve">The PT-only inference path through </w:t>
+      </w:r>
+      <m:oMath>
+        <m:r>
+          <w:rPr>
+            <w:rFonts w:ascii="Cambria Math" w:hAnsi="Cambria Math"/>
+          </w:rPr>
+          <m:t>moshi.offline</m:t>
+        </m:r>
+      </m:oMath>
+      <w:r>
+        <w:t xml:space="preserve"> was the gold-standard reference for both </w:t>
       </w:r>
       <m:oMath>
         <m:r>
@@ -1554,7 +1510,29 @@
         </m:r>
       </m:oMath>
       <w:r>
-        <w:t xml:space="preserve"> checkpoint as the gold standard baseline, uniquely capable of maintaining natural conversational prosody.</w:t>
+        <w:t xml:space="preserve"> and v12 evaluation; the rewritten </w:t>
+      </w:r>
+      <m:oMath>
+        <m:r>
+          <w:rPr>
+            <w:rFonts w:ascii="Cambria Math" w:hAnsi="Cambria Math"/>
+          </w:rPr>
+          <m:t>bmo_inference.py</m:t>
+        </m:r>
+      </m:oMath>
+      <w:r>
+        <w:t xml:space="preserve"> stream path imports the same LMGen + step_system_prompts flow when redirected to libbmo.so via </w:t>
+      </w:r>
+      <m:oMath>
+        <m:r>
+          <w:rPr>
+            <w:rFonts w:ascii="Cambria Math" w:hAnsi="Cambria Math"/>
+          </w:rPr>
+          <m:t>patch_lm_for_bmo</m:t>
+        </m:r>
+      </m:oMath>
+      <w:r>
+        <w:t>.</w:t>
       </w:r>
     </w:p>
     <w:p>
@@ -1578,48 +1556,16 @@
     </w:p>
     <w:p>
       <w:r>
-        <w:t xml:space="preserve">The 16.7 GB BF16 baseline required aggressive compression. An initial “Brain Transplant” strategy — replacing the 7B Temporal Transformer with smaller Qwen3.5 or Gemma-3 backbones — was ultimately rejected due to linear attention incompatibilities that disrupted </w:t>
-      </w:r>
-      <w:proofErr w:type="spellStart"/>
-      <w:r>
-        <w:t>TensorRT</w:t>
-      </w:r>
-      <w:proofErr w:type="spellEnd"/>
-      <w:r>
-        <w:t xml:space="preserve">-LLM </w:t>
-      </w:r>
-      <w:proofErr w:type="spellStart"/>
-      <w:r>
-        <w:t>PagedAttention</w:t>
-      </w:r>
-      <w:proofErr w:type="spellEnd"/>
-      <w:r>
-        <w:t xml:space="preserve">, alongside pervasive instruction-tuned residue that severely degraded conversational flow. Standard structural pruning via </w:t>
-      </w:r>
-      <w:proofErr w:type="spellStart"/>
-      <w:r>
-        <w:t>SliceGPT</w:t>
-      </w:r>
-      <w:proofErr w:type="spellEnd"/>
-      <w:r>
-        <w:t xml:space="preserve"> successfully concentrated approximately 99% of the dataset variance into 2632 dimensions; however, the subsequent Least Squares bridge calibration introduced a catastrophic 4421× gain explosion that saturated the logit pathway. Retraining the architecture from scratch was also deemed impractical, as a sufficiently large and high-quality conversational speech dataset did not exist in a usable form, and constructing one manually would have required weeks of preprocessing and training time on the available compute infrastructure.</w:t>
+        <w:t xml:space="preserve">The 16.7 GB BF16 baseline required aggressive compression. An initial “Brain Transplant” strategy — replacing the 7B Temporal Transformer with smaller Qwen3.5 or Gemma-3 backbones — was ultimately rejected due to linear attention incompatibilities that disrupted TensorRT-LLM PagedAttention, alongside pervasive instruction-tuned residue that severely degraded conversational flow. Standard structural pruning via SliceGPT successfully concentrated approximately 99% of the </w:t>
+      </w:r>
+      <w:r>
+        <w:lastRenderedPageBreak/>
+        <w:t>dataset variance into 2632 dimensions; however, the subsequent Least Squares bridge calibration introduced a catastrophic 4421× gain explosion that saturated the logit pathway. Retraining the architecture from scratch was also deemed impractical, as a sufficiently large and high-quality conversational speech dataset did not exist in a usable form, and constructing one manually would have required weeks of preprocessing and training time on the available compute infrastructure.</w:t>
       </w:r>
     </w:p>
     <w:p>
       <w:r>
-        <w:t xml:space="preserve">Once it became clear that the “Brain Transplant” strategy was not viable, attention shifted toward a sequence of increasingly aggressive INT4 quantization experiments, each of which ultimately failed for different architectural reasons. A naive global INT4 </w:t>
-      </w:r>
-      <w:r>
-        <w:lastRenderedPageBreak/>
-        <w:t xml:space="preserve">implementation destroyed acoustic coherence due to the fragility of the Depth Transformer. A Mixed-Precision NF4 attempt on the Temporal Transformer collapsed into gibberish </w:t>
-      </w:r>
-      <w:proofErr w:type="gramStart"/>
-      <w:r>
-        <w:t>as a result of</w:t>
-      </w:r>
-      <w:proofErr w:type="gramEnd"/>
-      <w:r>
-        <w:t xml:space="preserve"> extreme 40</w:t>
+        <w:t>Once it became clear that the “Brain Transplant” strategy was not viable, attention shifted toward a sequence of increasingly aggressive INT4 quantization experiments, each of which ultimately failed for different architectural reasons. A naive global INT4 implementation destroyed acoustic coherence due to the fragility of the Depth Transformer. A Mixed-Precision NF4 attempt on the Temporal Transformer collapsed into gibberish as a result of extreme 40</w:t>
       </w:r>
       <w:r>
         <w:t>x</w:t>
@@ -1644,13 +1590,8 @@
       <w:r>
         <w:t xml:space="preserve">a </w:t>
       </w:r>
-      <w:proofErr w:type="spellStart"/>
-      <w:r>
-        <w:t>SliceGPT</w:t>
-      </w:r>
-      <w:proofErr w:type="spellEnd"/>
-      <w:r>
-        <w:t xml:space="preserve"> </w:t>
+      <w:r>
+        <w:t xml:space="preserve">SliceGPT </w:t>
       </w:r>
       <w:r>
         <w:t>experiment</w:t>
@@ -1691,23 +1632,7 @@
         </w:sdtContent>
       </w:sdt>
       <w:r>
-        <w:t xml:space="preserve">. While the global covariance analysis successfully isolated 99% of the dataset's variance into 2632 dimensions, the Least Squares bridge calibration caused a catastrophic 4421x gain explosion, violently saturating the logit path and </w:t>
-      </w:r>
-      <w:proofErr w:type="gramStart"/>
-      <w:r>
-        <w:t>completely destroying</w:t>
-      </w:r>
-      <w:proofErr w:type="gramEnd"/>
-      <w:r>
-        <w:t xml:space="preserve"> the </w:t>
-      </w:r>
-      <w:proofErr w:type="gramStart"/>
-      <w:r>
-        <w:t>Top-1</w:t>
-      </w:r>
-      <w:proofErr w:type="gramEnd"/>
-      <w:r>
-        <w:t xml:space="preserve"> token agreement. Recognizing the mathematical insufficiency of structural pruning to meet a 75% compression target, the project pivoted decisively to SEPTQ</w:t>
+        <w:t>. While the global covariance analysis successfully isolated 99% of the dataset's variance into 2632 dimensions, the Least Squares bridge calibration caused a catastrophic 4421x gain explosion, violently saturating the logit path and completely destroying the Top-1 token agreement. Recognizing the mathematical insufficiency of structural pruning to meet a 75% compression target, the project pivoted decisively to SEPTQ</w:t>
       </w:r>
       <w:sdt>
         <w:sdtPr>
@@ -1818,7 +1743,19 @@
     </w:p>
     <w:p>
       <w:r>
-        <w:t xml:space="preserve">The initial Config A sweep mapped a four-tier precision gradient targeting an aggressive 4.274 Bits-Per-Weight (BPW). This proved mathematically destructive, plunging the Layer 0 </w:t>
+        <w:t>The initial Config A sweep mapped a four-tier precision gradient targeting an aggressive 4.274 Bits-Per-Weight (BPW)</w:t>
+      </w:r>
+      <w:r>
+        <w:t xml:space="preserve"> (</w:t>
+      </w:r>
+      <w:r>
+        <w:t>0.1% FP16, 1% INT8, 10% INT4, 88.9% INT2</w:t>
+      </w:r>
+      <w:r>
+        <w:t>)</w:t>
+      </w:r>
+      <w:r>
+        <w:t xml:space="preserve">. This proved mathematically destructive, plunging the Layer 0 </w:t>
       </w:r>
       <m:oMath>
         <m:r>
@@ -1829,7 +1766,19 @@
         </m:r>
       </m:oMath>
       <w:r>
-        <w:t xml:space="preserve"> cosine similarity down to 0.812111. Formulating a more conservative approach, the Half Cushion Max v10 configuration targeted 5.72 BPW and introduced a critical </w:t>
+        <w:t xml:space="preserve"> cosine similarity down to 0.812111. Formulating a more conservative approach, the Half Cushion Max v10 configuration </w:t>
+      </w:r>
+      <w:r>
+        <w:t>(</w:t>
+      </w:r>
+      <w:r>
+        <w:t>2% FP16 / 12% INT8 / 36% INT4 / 50% INT2</w:t>
+      </w:r>
+      <w:r>
+        <w:t xml:space="preserve">) </w:t>
+      </w:r>
+      <w:r>
+        <w:t xml:space="preserve">targeted 5.72 BPW and introduced a critical </w:t>
       </w:r>
       <m:oMath>
         <m:r>
@@ -2001,7 +1950,6 @@
         <w:rPr>
           <w:noProof/>
         </w:rPr>
-        <w:lastRenderedPageBreak/>
         <w:drawing>
           <wp:inline distT="0" distB="0" distL="0" distR="0" wp14:anchorId="1A320D3B" wp14:editId="203ECD46">
             <wp:extent cx="5731510" cy="2573271"/>
@@ -2084,19 +2032,12 @@
         <w:fldChar w:fldCharType="end"/>
       </w:r>
       <w:r>
-        <w:t xml:space="preserve"> SE</w:t>
-      </w:r>
-      <w:r>
         <w:t xml:space="preserve"> </w:t>
       </w:r>
       <w:r>
-        <w:t>SEPTQ Tier Assignment: A layer-wise heatmap across all 32 temporal transformer layers showing the FP16, INT8, INT4, and INT2 precision designations assigned to each module based on Hessian saliency scores. Colour coding: green=FP16 protected, yellow=INT8, orange=INT4, red=INT2.]</w:t>
-      </w:r>
-      <w:r>
-        <w:t xml:space="preserve"> </w:t>
+        <w:t>SEPTQ within-tensor tier assignment for a representative module (L0.self_attn.in_proj_weight). Each of the four panels shows the local fraction-per-tile of one precision tier within the downsampled weight matrix (256 × 384 tiles, ~48 × 11 weights per tile). Bright regions in the FP16 (green) panel correspond to output dimensions where the Hessian-saliency router concentrated full-precision weights  these align with the activation-outlier channels discussed in Performance Analysis. The progression FP16 → INT8 → INT4 → INT2 traces the gradient from "few, high-precision" outlier rows to "bulk, aggressively quantized" non-salient weights. The side panel reports the stack-wide tier mix (2 / 12 / 36 / 50 %) yielding a mean 3.72 effective bits-per-weight across all 93 quantized modules.</w:t>
       </w:r>
     </w:p>
-    <w:p/>
     <w:p>
       <w:pPr>
         <w:rPr>
@@ -2147,15 +2088,7 @@
         </w:sdtContent>
       </w:sdt>
       <w:r>
-        <w:t xml:space="preserve">, while a Straight-Through Estimator (STE) bypass routed gradients directly to the underlying continuous proxy weights during backpropagation. Optimization was performed using the AdamW8bit algorithm to minimize VRAM overhead throughout the training loop. The loss function was formulated around </w:t>
-      </w:r>
-      <w:proofErr w:type="spellStart"/>
-      <w:r>
-        <w:t>Kullback</w:t>
-      </w:r>
-      <w:proofErr w:type="spellEnd"/>
-      <w:r>
-        <w:t xml:space="preserve">-Leibler (KL) divergence distillation, penalizing deviations between the quantized student logits and the dense BF16 teacher distribution. A strict plateau rollback system monitored the target median cosine similarity, calibrated to 0.999, automatically reverting the model state whenever validation drift exceeded dynamic thresholds. The 500-step execution completed successfully, achieving a peak 0.9727 median cosine similarity and producing the optimized </w:t>
+        <w:t xml:space="preserve">, while a Straight-Through Estimator (STE) bypass routed gradients directly to the underlying continuous proxy weights during backpropagation. Optimization was performed using the AdamW8bit algorithm to minimize VRAM overhead throughout the training loop. The loss function was formulated around Kullback-Leibler (KL) divergence distillation, penalizing deviations between the quantized student logits and the dense BF16 teacher distribution. A strict plateau rollback system monitored the target median cosine similarity, calibrated to 0.999, automatically reverting the model state whenever validation drift exceeded dynamic thresholds. The 500-step execution completed successfully, achieving a peak 0.9727 median cosine similarity and producing the optimized </w:t>
       </w:r>
       <m:oMath>
         <m:r>
@@ -2171,39 +2104,38 @@
     </w:p>
     <w:p>
       <w:r>
-        <w:t xml:space="preserve">Executing the C++ inference engine on the Jetson Orin Nano required overcoming severe OS-level and memory-management bottlenecks. The standard </w:t>
-      </w:r>
-      <w:proofErr w:type="spellStart"/>
-      <w:r>
-        <w:t>PyTorch</w:t>
-      </w:r>
-      <w:proofErr w:type="spellEnd"/>
-      <w:r>
-        <w:t xml:space="preserve"> serialization pathway encapsulated the compressed 2-bit weights within 16-bit containers, inflating the model into a 17 GB payload that immediately exhausted heap memory during loading. This was resolved through an </w:t>
-      </w:r>
-      <w:proofErr w:type="spellStart"/>
-      <w:r>
-        <w:t>mmap</w:t>
-      </w:r>
-      <w:proofErr w:type="spellEnd"/>
-      <w:r>
-        <w:t xml:space="preserve"> bypass implemented within </w:t>
+        <w:lastRenderedPageBreak/>
+        <w:t xml:space="preserve">Executing the C++ inference engine on the Jetson Orin Nano required overcoming severe OS-level and memory-management bottlenecks. </w:t>
+      </w:r>
+      <w:r>
+        <w:t>The PyTorch serialization pathway encapsulated the compressed 2/4/8-bit weight streams within FP16 containers, inflating the on-disk artefact to ~17 GB and exhausting heap during loading on the Jetson. The C++ deployment loader (</w:t>
       </w:r>
       <m:oMath>
         <m:r>
           <w:rPr>
             <w:rFonts w:ascii="Cambria Math" w:hAnsi="Cambria Math"/>
           </w:rPr>
-          <m:t>profile_jetson.py</m:t>
+          <m:t>bmo.cpp::bmo_load_model</m:t>
         </m:r>
       </m:oMath>
       <w:r>
-        <w:t>, leveraging Memory Mapping alongside cudaHostRegister pinned mapped memory to enable a Zero-Copy configuration in which CUDA cores could access model weights directly across the system bus.</w:t>
+        <w:t>) bypasses this by reading GGUF tensors directly into two explicit host-side pools</w:t>
+      </w:r>
+      <w:r>
+        <w:t xml:space="preserve">, </w:t>
+      </w:r>
+      <w:r>
+        <w:t>a scalar pool for small tensors and a page-aligned big pool for large quantized matrices</w:t>
+      </w:r>
+      <w:r>
+        <w:t xml:space="preserve">, </w:t>
+      </w:r>
+      <w:r>
+        <w:t>using pread against the GGUF file rather than relying on operating-system demand paging. On Jetson builds, the big pool is then registered with cudaHostRegister and exposed to CUDA via cudaHostGetDevicePointer, producing a device-mapped alias of the fully-resident host buffer so kernels can stream from pinned memory without a second device-side weight copy. The runtime therefore depends on full materialization of weights rather than an idealized lazy-mmap curve.</w:t>
       </w:r>
     </w:p>
     <w:p>
       <w:r>
-        <w:lastRenderedPageBreak/>
         <w:t xml:space="preserve">The export and deployment pipeline additionally required extensive forensic debugging to resolve four critical GGUF conversion failures. The </w:t>
       </w:r>
       <m:oMath>
@@ -2243,34 +2175,13 @@
     </w:p>
     <w:p>
       <w:r>
-        <w:t xml:space="preserve">At the time of writing, the C++ deployment pipeline remains under active optimization. The custom CUDA kernel infrastructure can successfully load and execute the complete model on the Jetson platform, although current inference latency remains approximately 800 </w:t>
-      </w:r>
-      <w:proofErr w:type="spellStart"/>
-      <w:r>
-        <w:t>ms</w:t>
-      </w:r>
-      <w:proofErr w:type="spellEnd"/>
+        <w:t>At the time of writing, the C++ deployment pipeline remains under active optimization. The custom CUDA kernel infrastructure can successfully load and execute the complete model on the Jetson platform, although current inference latency remains approximately 800 ms</w:t>
+      </w:r>
       <w:r>
         <w:t xml:space="preserve">, </w:t>
       </w:r>
       <w:r>
-        <w:t xml:space="preserve">substantially above the ~80 </w:t>
-      </w:r>
-      <w:proofErr w:type="spellStart"/>
-      <w:r>
-        <w:t>ms</w:t>
-      </w:r>
-      <w:proofErr w:type="spellEnd"/>
-      <w:r>
-        <w:t xml:space="preserve"> achieved by the native </w:t>
-      </w:r>
-      <w:proofErr w:type="spellStart"/>
-      <w:r>
-        <w:t>PyTorch</w:t>
-      </w:r>
-      <w:proofErr w:type="spellEnd"/>
-      <w:r>
-        <w:t xml:space="preserve"> implementation on the H100. Nevertheless, the deployment stack has progressed beyond a non-functional scaffold: </w:t>
+        <w:t xml:space="preserve">substantially above the ~80 ms achieved by the native PyTorch implementation on the H100. Nevertheless, the deployment stack has progressed beyond a non-functional scaffold: </w:t>
       </w:r>
       <m:oMath>
         <m:r>
@@ -2353,12 +2264,19 @@
         <w:pStyle w:val="Heading1"/>
       </w:pPr>
       <w:r>
+        <w:lastRenderedPageBreak/>
         <w:t>Datasets</w:t>
       </w:r>
     </w:p>
     <w:p>
       <w:r>
-        <w:t xml:space="preserve">The culmination of the data processing pipeline produced a final dataset comprising 968 highly curated acoustic clips, totalling 37.2 </w:t>
+        <w:t xml:space="preserve">The culmination of the data processing pipeline produced a final dataset comprising </w:t>
+      </w:r>
+      <w:r>
+        <w:t>971</w:t>
+      </w:r>
+      <w:r>
+        <w:t xml:space="preserve"> highly curated acoustic clips, totalling 37.2 </w:t>
       </w:r>
       <w:r>
         <w:t>minutes</w:t>
@@ -2419,11 +2337,11 @@
         <w:tblLook w:val="04A0" w:firstRow="1" w:lastRow="0" w:firstColumn="1" w:lastColumn="0" w:noHBand="0" w:noVBand="1"/>
       </w:tblPr>
       <w:tblGrid>
-        <w:gridCol w:w="1950"/>
-        <w:gridCol w:w="1134"/>
-        <w:gridCol w:w="1747"/>
-        <w:gridCol w:w="1876"/>
-        <w:gridCol w:w="2481"/>
+        <w:gridCol w:w="1951"/>
+        <w:gridCol w:w="1130"/>
+        <w:gridCol w:w="1748"/>
+        <w:gridCol w:w="1877"/>
+        <w:gridCol w:w="2482"/>
       </w:tblGrid>
       <w:tr>
         <w:trPr>
@@ -2574,7 +2492,6 @@
                 <w:sz w:val="22"/>
                 <w:szCs w:val="22"/>
               </w:rPr>
-              <w:lastRenderedPageBreak/>
               <w:t>Verbal</w:t>
             </w:r>
           </w:p>
@@ -2597,7 +2514,14 @@
                 <w:sz w:val="22"/>
                 <w:szCs w:val="22"/>
               </w:rPr>
-              <w:t>940</w:t>
+              <w:t>9</w:t>
+            </w:r>
+            <w:r>
+              <w:rPr>
+                <w:sz w:val="22"/>
+                <w:szCs w:val="22"/>
+              </w:rPr>
+              <w:t>10</w:t>
             </w:r>
           </w:p>
         </w:tc>
@@ -2738,7 +2662,7 @@
                 <w:sz w:val="22"/>
                 <w:szCs w:val="22"/>
               </w:rPr>
-              <w:t>23</w:t>
+              <w:t>32</w:t>
             </w:r>
           </w:p>
         </w:tc>
@@ -2872,7 +2796,7 @@
                 <w:sz w:val="22"/>
                 <w:szCs w:val="22"/>
               </w:rPr>
-              <w:t>26</w:t>
+              <w:t>19</w:t>
             </w:r>
           </w:p>
         </w:tc>
@@ -2984,7 +2908,7 @@
                 <w:sz w:val="22"/>
                 <w:szCs w:val="22"/>
               </w:rPr>
-              <w:t>Non-Verbal (gasp)</w:t>
+              <w:t>Non-Verbal (scream)</w:t>
             </w:r>
           </w:p>
         </w:tc>
@@ -3006,7 +2930,7 @@
                 <w:sz w:val="22"/>
                 <w:szCs w:val="22"/>
               </w:rPr>
-              <w:t>4</w:t>
+              <w:t>9</w:t>
             </w:r>
           </w:p>
         </w:tc>
@@ -3028,7 +2952,7 @@
                 <w:sz w:val="22"/>
                 <w:szCs w:val="22"/>
               </w:rPr>
-              <w:t>1.32</w:t>
+              <w:t>1.48</w:t>
             </w:r>
           </w:p>
         </w:tc>
@@ -3050,7 +2974,7 @@
                 <w:sz w:val="22"/>
                 <w:szCs w:val="22"/>
               </w:rPr>
-              <w:t>1.27</w:t>
+              <w:t>1.35</w:t>
             </w:r>
           </w:p>
         </w:tc>
@@ -3118,7 +3042,7 @@
                 <w:sz w:val="22"/>
                 <w:szCs w:val="22"/>
               </w:rPr>
-              <w:t>Non-Verbal (scream)</w:t>
+              <w:t>Non-Verbal (grunt)</w:t>
             </w:r>
           </w:p>
         </w:tc>
@@ -3140,7 +3064,7 @@
                 <w:sz w:val="22"/>
                 <w:szCs w:val="22"/>
               </w:rPr>
-              <w:t>21</w:t>
+              <w:t>1</w:t>
             </w:r>
           </w:p>
         </w:tc>
@@ -3162,7 +3086,7 @@
                 <w:sz w:val="22"/>
                 <w:szCs w:val="22"/>
               </w:rPr>
-              <w:t>1.48</w:t>
+              <w:t>1.39</w:t>
             </w:r>
           </w:p>
         </w:tc>
@@ -3184,7 +3108,7 @@
                 <w:sz w:val="22"/>
                 <w:szCs w:val="22"/>
               </w:rPr>
-              <w:t>1.35</w:t>
+              <w:t>1.39</w:t>
             </w:r>
           </w:p>
         </w:tc>
@@ -3252,120 +3176,10 @@
                 <w:sz w:val="22"/>
                 <w:szCs w:val="22"/>
               </w:rPr>
-              <w:t>Non-Verbal (grunt)</w:t>
-            </w:r>
-          </w:p>
-        </w:tc>
-        <w:tc>
-          <w:tcPr>
-            <w:tcW w:w="0" w:type="auto"/>
-            <w:hideMark/>
-          </w:tcPr>
-          <w:p>
-            <w:pPr>
-              <w:spacing w:after="160" w:line="278" w:lineRule="auto"/>
-              <w:rPr>
-                <w:sz w:val="22"/>
-                <w:szCs w:val="22"/>
-              </w:rPr>
-            </w:pPr>
-            <w:r>
-              <w:rPr>
-                <w:sz w:val="22"/>
-                <w:szCs w:val="22"/>
-              </w:rPr>
-              <w:t>1</w:t>
-            </w:r>
-          </w:p>
-        </w:tc>
-        <w:tc>
-          <w:tcPr>
-            <w:tcW w:w="0" w:type="auto"/>
-            <w:hideMark/>
-          </w:tcPr>
-          <w:p>
-            <w:pPr>
-              <w:spacing w:after="160" w:line="278" w:lineRule="auto"/>
-              <w:rPr>
-                <w:sz w:val="22"/>
-                <w:szCs w:val="22"/>
-              </w:rPr>
-            </w:pPr>
-            <w:r>
-              <w:rPr>
-                <w:sz w:val="22"/>
-                <w:szCs w:val="22"/>
-              </w:rPr>
-              <w:t>1.39</w:t>
-            </w:r>
-          </w:p>
-        </w:tc>
-        <w:tc>
-          <w:tcPr>
-            <w:tcW w:w="0" w:type="auto"/>
-            <w:hideMark/>
-          </w:tcPr>
-          <w:p>
-            <w:pPr>
-              <w:spacing w:after="160" w:line="278" w:lineRule="auto"/>
-              <w:rPr>
-                <w:sz w:val="22"/>
-                <w:szCs w:val="22"/>
-              </w:rPr>
-            </w:pPr>
-            <w:r>
-              <w:rPr>
-                <w:sz w:val="22"/>
-                <w:szCs w:val="22"/>
-              </w:rPr>
-              <w:t>1.39</w:t>
-            </w:r>
-          </w:p>
-        </w:tc>
-        <w:tc>
-          <w:tcPr>
-            <w:tcW w:w="0" w:type="auto"/>
-            <w:hideMark/>
-          </w:tcPr>
-          <w:p>
-            <w:pPr>
-              <w:spacing w:after="160" w:line="278" w:lineRule="auto"/>
-              <w:rPr>
-                <w:sz w:val="22"/>
-                <w:szCs w:val="22"/>
-              </w:rPr>
-            </w:pPr>
-            <w:r>
-              <w:rPr>
-                <w:sz w:val="22"/>
-                <w:szCs w:val="22"/>
-              </w:rPr>
-              <w:t xml:space="preserve">CLAP cosine </w:t>
-            </w:r>
-            <m:oMath>
-              <m:r>
-                <w:rPr>
-                  <w:rFonts w:ascii="Cambria Math" w:hAnsi="Cambria Math"/>
-                  <w:sz w:val="22"/>
-                  <w:szCs w:val="22"/>
-                </w:rPr>
-                <m:t>≥</m:t>
-              </m:r>
-            </m:oMath>
-            <w:r>
-              <w:rPr>
-                <w:sz w:val="22"/>
-                <w:szCs w:val="22"/>
-              </w:rPr>
-              <w:t xml:space="preserve"> 0.78</w:t>
-            </w:r>
-          </w:p>
-        </w:tc>
-      </w:tr>
-      <w:tr>
-        <w:trPr>
-          <w:trHeight w:val="18"/>
-        </w:trPr>
+              <w:t>Total</w:t>
+            </w:r>
+          </w:p>
+        </w:tc>
         <w:tc>
           <w:tcPr>
             <w:tcW w:w="0" w:type="auto"/>
@@ -3386,165 +3200,7 @@
                 <w:sz w:val="22"/>
                 <w:szCs w:val="22"/>
               </w:rPr>
-              <w:t>Non-Verbal (sigh)</w:t>
-            </w:r>
-          </w:p>
-        </w:tc>
-        <w:tc>
-          <w:tcPr>
-            <w:tcW w:w="0" w:type="auto"/>
-            <w:hideMark/>
-          </w:tcPr>
-          <w:p>
-            <w:pPr>
-              <w:spacing w:after="160" w:line="278" w:lineRule="auto"/>
-              <w:rPr>
-                <w:sz w:val="22"/>
-                <w:szCs w:val="22"/>
-              </w:rPr>
-            </w:pPr>
-            <w:r>
-              <w:rPr>
-                <w:sz w:val="22"/>
-                <w:szCs w:val="22"/>
-              </w:rPr>
-              <w:t>2</w:t>
-            </w:r>
-          </w:p>
-        </w:tc>
-        <w:tc>
-          <w:tcPr>
-            <w:tcW w:w="0" w:type="auto"/>
-            <w:hideMark/>
-          </w:tcPr>
-          <w:p>
-            <w:pPr>
-              <w:spacing w:after="160" w:line="278" w:lineRule="auto"/>
-              <w:rPr>
-                <w:sz w:val="22"/>
-                <w:szCs w:val="22"/>
-              </w:rPr>
-            </w:pPr>
-            <w:r>
-              <w:rPr>
-                <w:sz w:val="22"/>
-                <w:szCs w:val="22"/>
-              </w:rPr>
-              <w:t>1.55</w:t>
-            </w:r>
-          </w:p>
-        </w:tc>
-        <w:tc>
-          <w:tcPr>
-            <w:tcW w:w="0" w:type="auto"/>
-            <w:hideMark/>
-          </w:tcPr>
-          <w:p>
-            <w:pPr>
-              <w:spacing w:after="160" w:line="278" w:lineRule="auto"/>
-              <w:rPr>
-                <w:sz w:val="22"/>
-                <w:szCs w:val="22"/>
-              </w:rPr>
-            </w:pPr>
-            <w:r>
-              <w:rPr>
-                <w:sz w:val="22"/>
-                <w:szCs w:val="22"/>
-              </w:rPr>
-              <w:t>1.55</w:t>
-            </w:r>
-          </w:p>
-        </w:tc>
-        <w:tc>
-          <w:tcPr>
-            <w:tcW w:w="0" w:type="auto"/>
-            <w:hideMark/>
-          </w:tcPr>
-          <w:p>
-            <w:pPr>
-              <w:spacing w:after="160" w:line="278" w:lineRule="auto"/>
-              <w:rPr>
-                <w:sz w:val="22"/>
-                <w:szCs w:val="22"/>
-              </w:rPr>
-            </w:pPr>
-            <w:r>
-              <w:rPr>
-                <w:sz w:val="22"/>
-                <w:szCs w:val="22"/>
-              </w:rPr>
-              <w:t xml:space="preserve">CLAP cosine </w:t>
-            </w:r>
-            <m:oMath>
-              <m:r>
-                <w:rPr>
-                  <w:rFonts w:ascii="Cambria Math" w:hAnsi="Cambria Math"/>
-                  <w:sz w:val="22"/>
-                  <w:szCs w:val="22"/>
-                </w:rPr>
-                <m:t>≥</m:t>
-              </m:r>
-            </m:oMath>
-            <w:r>
-              <w:rPr>
-                <w:sz w:val="22"/>
-                <w:szCs w:val="22"/>
-              </w:rPr>
-              <w:t xml:space="preserve"> 0.78</w:t>
-            </w:r>
-          </w:p>
-        </w:tc>
-      </w:tr>
-      <w:tr>
-        <w:trPr>
-          <w:trHeight w:val="18"/>
-        </w:trPr>
-        <w:tc>
-          <w:tcPr>
-            <w:tcW w:w="0" w:type="auto"/>
-            <w:hideMark/>
-          </w:tcPr>
-          <w:p>
-            <w:pPr>
-              <w:spacing w:after="160" w:line="278" w:lineRule="auto"/>
-              <w:rPr>
-                <w:sz w:val="22"/>
-                <w:szCs w:val="22"/>
-              </w:rPr>
-            </w:pPr>
-            <w:r>
-              <w:rPr>
-                <w:b/>
-                <w:bCs/>
-                <w:sz w:val="22"/>
-                <w:szCs w:val="22"/>
-              </w:rPr>
-              <w:t>Total</w:t>
-            </w:r>
-          </w:p>
-        </w:tc>
-        <w:tc>
-          <w:tcPr>
-            <w:tcW w:w="0" w:type="auto"/>
-            <w:hideMark/>
-          </w:tcPr>
-          <w:p>
-            <w:pPr>
-              <w:spacing w:after="160" w:line="278" w:lineRule="auto"/>
-              <w:rPr>
-                <w:sz w:val="22"/>
-                <w:szCs w:val="22"/>
-              </w:rPr>
-            </w:pPr>
-            <w:r>
-              <w:rPr>
-                <w:b/>
-                <w:bCs/>
-                <w:sz w:val="22"/>
-                <w:szCs w:val="22"/>
-              </w:rPr>
-              <w:t>1,017</w:t>
+              <w:t>971</w:t>
             </w:r>
           </w:p>
         </w:tc>
@@ -3622,37 +3278,107 @@
     </w:tbl>
     <w:p>
       <w:r>
-        <w:t>The dataset possesses distinct limitations that impact deployment. Principally, the data captures a highly performed, stylized voice rather than natural, spontaneous speech, complicating the model's ability to extrapolate casual conversational rhythms. Furthermore, the selection of the 0.50 ECAPA-TDNN threshold, while maximizing data retention, inherently risks admitting false positive vocalizations from characters sharing similar acoustic registers. Finally, the cumulative 37.2-minute duration falls demonstrably below the scientifically recommended minimum for robust, artifact-free voice identity adaptation, necessitating the heavy reliance on pre-trained topological priors.</w:t>
+        <w:t>Despite meticulous curation, the dataset possesses inherent mathematical and contextual limitations. Primarily, the dataset captures only the characters highly performed, theatrical voice generated within a cinematic context, and fundamentally lacks instances of natural, spontaneous conversational speech. Secondly, while the ECAPA-TDNN 0.50 threshold successfully isolated the vast majority of the character's dialogue, it inherently carries the statistical risk of admitting false positive audio frames from overlapping characters operating within a similar acoustic pitch register. Finally, the aggregate sum of 37.2 minutes falls significantly below the recommended minimum data volumes required for robust, highly generalized neural voice adaptation, placing a severe operational burden on the pre-existing PersonaPlex conversational priors to bridge the generative gaps.</w:t>
       </w:r>
     </w:p>
     <w:p>
-      <w:r>
-        <w:t xml:space="preserve">Despite meticulous curation, the dataset possesses inherent mathematical and contextual limitations. Primarily, the dataset captures only the characters highly performed, theatrical voice generated within a cinematic context, and fundamentally lacks instances of natural, spontaneous conversational speech. Secondly, while the ECAPA-TDNN 0.50 threshold successfully isolated </w:t>
-      </w:r>
-      <w:proofErr w:type="gramStart"/>
-      <w:r>
-        <w:t>the vast majority of</w:t>
-      </w:r>
-      <w:proofErr w:type="gramEnd"/>
-      <w:r>
-        <w:t xml:space="preserve"> the character's dialogue, it inherently carries the statistical risk of admitting false positive audio frames from overlapping characters operating within a similar acoustic pitch register. Finally, the aggregate sum of 37.2 minutes falls significantly below the recommended minimum data volumes required for robust, highly generalized neural voice adaptation, placing a severe operational burden on the pre-existing </w:t>
-      </w:r>
-      <w:proofErr w:type="spellStart"/>
-      <w:r>
-        <w:t>PersonaPlex</w:t>
-      </w:r>
-      <w:proofErr w:type="spellEnd"/>
-      <w:r>
-        <w:t xml:space="preserve"> conversational priors to bridge the generative gaps.</w:t>
+      <w:pPr>
+        <w:keepNext/>
+        <w:jc w:val="center"/>
+      </w:pPr>
+      <w:r>
+        <w:rPr>
+          <w:noProof/>
+        </w:rPr>
+        <w:lastRenderedPageBreak/>
+        <w:drawing>
+          <wp:inline distT="0" distB="0" distL="0" distR="0" wp14:anchorId="2AB108FF" wp14:editId="748EF7B5">
+            <wp:extent cx="5731466" cy="2924978"/>
+            <wp:effectExtent l="0" t="0" r="3175" b="8890"/>
+            <wp:docPr id="85308451" name="Picture 7"/>
+            <wp:cNvGraphicFramePr>
+              <a:graphicFrameLocks xmlns:a="http://schemas.openxmlformats.org/drawingml/2006/main" noChangeAspect="1"/>
+            </wp:cNvGraphicFramePr>
+            <a:graphic xmlns:a="http://schemas.openxmlformats.org/drawingml/2006/main">
+              <a:graphicData uri="http://schemas.openxmlformats.org/drawingml/2006/picture">
+                <pic:pic xmlns:pic="http://schemas.openxmlformats.org/drawingml/2006/picture">
+                  <pic:nvPicPr>
+                    <pic:cNvPr id="0" name="Picture 19"/>
+                    <pic:cNvPicPr>
+                      <a:picLocks noChangeAspect="1" noChangeArrowheads="1"/>
+                    </pic:cNvPicPr>
+                  </pic:nvPicPr>
+                  <pic:blipFill rotWithShape="1">
+                    <a:blip r:embed="rId12" cstate="print">
+                      <a:extLst>
+                        <a:ext uri="{28A0092B-C50C-407E-A947-70E740481C1C}">
+                          <a14:useLocalDpi xmlns:a14="http://schemas.microsoft.com/office/drawing/2010/main" val="0"/>
+                        </a:ext>
+                      </a:extLst>
+                    </a:blip>
+                    <a:srcRect t="6369" b="2236"/>
+                    <a:stretch>
+                      <a:fillRect/>
+                    </a:stretch>
+                  </pic:blipFill>
+                  <pic:spPr bwMode="auto">
+                    <a:xfrm>
+                      <a:off x="0" y="0"/>
+                      <a:ext cx="5731510" cy="2925000"/>
+                    </a:xfrm>
+                    <a:prstGeom prst="rect">
+                      <a:avLst/>
+                    </a:prstGeom>
+                    <a:noFill/>
+                    <a:ln>
+                      <a:noFill/>
+                    </a:ln>
+                    <a:extLst>
+                      <a:ext uri="{53640926-AAD7-44D8-BBD7-CCE9431645EC}">
+                        <a14:shadowObscured xmlns:a14="http://schemas.microsoft.com/office/drawing/2010/main"/>
+                      </a:ext>
+                    </a:extLst>
+                  </pic:spPr>
+                </pic:pic>
+              </a:graphicData>
+            </a:graphic>
+          </wp:inline>
+        </w:drawing>
       </w:r>
     </w:p>
-    <w:p/>
     <w:p>
-      <w:r>
-        <w:t>[FIGURE 4 — Acoustic Clip Duration Distribution: Histogram of clip durations from 1.0 to 12.0 seconds showing right-skewed distribution with mean at 2.30s and median at 1.86s.]</w:t>
+      <w:pPr>
+        <w:pStyle w:val="Caption"/>
+        <w:jc w:val="center"/>
+      </w:pPr>
+      <w:r>
+        <w:t xml:space="preserve">Figure </w:t>
+      </w:r>
+      <w:r>
+        <w:fldChar w:fldCharType="begin"/>
+      </w:r>
+      <w:r>
+        <w:instrText xml:space="preserve"> SEQ Figure \* ARABIC </w:instrText>
+      </w:r>
+      <w:r>
+        <w:fldChar w:fldCharType="separate"/>
+      </w:r>
+      <w:r>
+        <w:rPr>
+          <w:noProof/>
+        </w:rPr>
+        <w:t>5</w:t>
+      </w:r>
+      <w:r>
+        <w:fldChar w:fldCharType="end"/>
+      </w:r>
+      <w:r>
+        <w:t xml:space="preserve"> </w:t>
+      </w:r>
+      <w:r>
+        <w:t>Acoustic Clip Duration Distribution</w:t>
       </w:r>
     </w:p>
-    <w:p/>
     <w:p>
       <w:pPr>
         <w:pStyle w:val="Heading1"/>
@@ -4466,6 +4192,7 @@
         <w:rPr>
           <w:rFonts w:eastAsiaTheme="minorEastAsia"/>
         </w:rPr>
+        <w:lastRenderedPageBreak/>
         <w:t xml:space="preserve">This factorisation explains why the Depth Transformer cannot survive precision reduction: it receives </w:t>
       </w:r>
       <m:oMath>
@@ -5828,34 +5555,40 @@
         <w:rPr>
           <w:rFonts w:eastAsiaTheme="minorEastAsia"/>
         </w:rPr>
-        <w:t xml:space="preserve">The Fused Dequantization </w:t>
-      </w:r>
-      <w:proofErr w:type="spellStart"/>
-      <w:r>
-        <w:rPr>
-          <w:rFonts w:eastAsiaTheme="minorEastAsia"/>
-        </w:rPr>
-        <w:t>Matvec</w:t>
-      </w:r>
-      <w:proofErr w:type="spellEnd"/>
-      <w:r>
-        <w:rPr>
-          <w:rFonts w:eastAsiaTheme="minorEastAsia"/>
-        </w:rPr>
-        <w:t xml:space="preserve"> Kernel</w:t>
+        <w:t>The Fused Dequantization Matvec Kernel</w:t>
       </w:r>
     </w:p>
     <w:p>
       <w:r>
-        <w:t xml:space="preserve">For on-device execution, the custom C++ inference engine utilizes a fused dequantization </w:t>
-      </w:r>
-      <w:proofErr w:type="spellStart"/>
-      <w:r>
-        <w:t>matvec</w:t>
-      </w:r>
-      <w:proofErr w:type="spellEnd"/>
-      <w:r>
-        <w:t xml:space="preserve"> kernel. This highly optimized CUDA module is governed by a strict ROWS_PER_BLOCK=8 warp assignment logic. The kernel executes per-tier decoding logic dynamically and relies on hyper-fast warp-shuffle reduction primitives to compute dot products without accessing slower shared memory layers.</w:t>
+        <w:t xml:space="preserve">For on-device execution, the custom C++ inference engine utilizes a fused dequantization matvec kernel. </w:t>
+      </w:r>
+      <w:r>
+        <w:t xml:space="preserve">The kernel processes 8 rows per thread block with 256 threads, stages the per-tier packed byte streams into shared memory to amortize the global-memory load across all rows in the block, dequantizes lanes on-the-fly inside the matvec, and uses warp-shuffle primitives for the final per-row reduction. For SEPTQ packing-version 5 (per-element 2-bit tier mask), the dispatch falls to </w:t>
+      </w:r>
+      <m:oMath>
+        <m:r>
+          <w:rPr>
+            <w:rFonts w:ascii="Cambria Math" w:hAnsi="Cambria Math"/>
+          </w:rPr>
+          <m:t>fused_dequant_matvec_kernel_proto</m:t>
+        </m:r>
+      </m:oMath>
+      <w:r>
+        <w:t xml:space="preserve"> in</w:t>
+      </w:r>
+      <w:r>
+        <w:t xml:space="preserve"> </w:t>
+      </w:r>
+      <m:oMath>
+        <m:r>
+          <w:rPr>
+            <w:rFonts w:ascii="Cambria Math" w:hAnsi="Cambria Math"/>
+          </w:rPr>
+          <m:t>bmo_cuda_kernels_proto.cu</m:t>
+        </m:r>
+      </m:oMath>
+      <w:r>
+        <w:t>, which performs the same role with a warp-local prefix scan to recover per-element stream offsets.</w:t>
       </w:r>
     </w:p>
     <w:p>
@@ -5863,7 +5596,6 @@
         <w:pStyle w:val="Heading1"/>
       </w:pPr>
       <w:r>
-        <w:lastRenderedPageBreak/>
         <w:t>C</w:t>
       </w:r>
       <w:r>
@@ -5873,26 +5605,61 @@
     <w:p>
       <w:r>
         <w:t xml:space="preserve">The pursuit of fitting a 16.7 GB foundational artifact into a 5.5 GB unified memory envelope necessitated exhaustive comparative testing across multiple mathematical compression frameworks. The experimental results, presented systematically below, delineate the boundary between viable parameter compression and catastrophic geometric collapse. </w:t>
+      </w:r>
+    </w:p>
+    <w:p>
+      <w:pPr>
+        <w:pStyle w:val="Caption"/>
+        <w:keepNext/>
+        <w:jc w:val="center"/>
+      </w:pPr>
+      <w:r>
+        <w:t xml:space="preserve">Table </w:t>
+      </w:r>
+      <w:r>
+        <w:fldChar w:fldCharType="begin"/>
+      </w:r>
+      <w:r>
+        <w:instrText xml:space="preserve"> SEQ Table \* ARABIC </w:instrText>
+      </w:r>
+      <w:r>
+        <w:fldChar w:fldCharType="separate"/>
+      </w:r>
+      <w:r>
+        <w:rPr>
+          <w:noProof/>
+        </w:rPr>
+        <w:t>2</w:t>
+      </w:r>
+      <w:r>
+        <w:fldChar w:fldCharType="end"/>
+      </w:r>
+      <w:r>
+        <w:t xml:space="preserve"> </w:t>
+      </w:r>
+      <w:r>
+        <w:t>Compression Approach Comparison</w:t>
       </w:r>
     </w:p>
     <w:tbl>
       <w:tblPr>
         <w:tblStyle w:val="TableGridLight"/>
-        <w:tblW w:w="0" w:type="auto"/>
+        <w:tblW w:w="9209" w:type="dxa"/>
         <w:tblLook w:val="04A0" w:firstRow="1" w:lastRow="0" w:firstColumn="1" w:lastColumn="0" w:noHBand="0" w:noVBand="1"/>
       </w:tblPr>
       <w:tblGrid>
-        <w:gridCol w:w="1549"/>
-        <w:gridCol w:w="2064"/>
-        <w:gridCol w:w="1118"/>
-        <w:gridCol w:w="1453"/>
-        <w:gridCol w:w="1306"/>
-        <w:gridCol w:w="1526"/>
+        <w:gridCol w:w="1550"/>
+        <w:gridCol w:w="937"/>
+        <w:gridCol w:w="986"/>
+        <w:gridCol w:w="1366"/>
+        <w:gridCol w:w="1182"/>
+        <w:gridCol w:w="1280"/>
+        <w:gridCol w:w="1908"/>
       </w:tblGrid>
       <w:tr>
         <w:tc>
           <w:tcPr>
-            <w:tcW w:w="1129" w:type="dxa"/>
+            <w:tcW w:w="1550" w:type="dxa"/>
             <w:hideMark/>
           </w:tcPr>
           <w:p>
@@ -5916,7 +5683,7 @@
         </w:tc>
         <w:tc>
           <w:tcPr>
-            <w:tcW w:w="2064" w:type="dxa"/>
+            <w:tcW w:w="940" w:type="dxa"/>
             <w:hideMark/>
           </w:tcPr>
           <w:p>
@@ -5940,7 +5707,7 @@
         </w:tc>
         <w:tc>
           <w:tcPr>
-            <w:tcW w:w="0" w:type="auto"/>
+            <w:tcW w:w="986" w:type="dxa"/>
             <w:hideMark/>
           </w:tcPr>
           <w:p>
@@ -5964,9 +5731,6 @@
                 </m:sSubPr>
                 <m:e>
                   <m:r>
-                    <m:rPr>
-                      <m:sty m:val="p"/>
-                    </m:rPr>
                     <w:rPr>
                       <w:rFonts w:ascii="Cambria Math" w:hAnsi="Cambria Math"/>
                       <w:sz w:val="22"/>
@@ -5977,9 +5741,6 @@
                 </m:e>
                 <m:sub>
                   <m:r>
-                    <m:rPr>
-                      <m:sty m:val="p"/>
-                    </m:rPr>
                     <w:rPr>
                       <w:rFonts w:ascii="Cambria Math" w:hAnsi="Cambria Math"/>
                       <w:sz w:val="22"/>
@@ -6003,18 +5764,17 @@
         </w:tc>
         <w:tc>
           <w:tcPr>
-            <w:tcW w:w="0" w:type="auto"/>
-            <w:hideMark/>
-          </w:tcPr>
-          <w:p>
-            <w:pPr>
-              <w:spacing w:after="160" w:line="278" w:lineRule="auto"/>
-              <w:rPr>
-                <w:sz w:val="22"/>
-                <w:szCs w:val="22"/>
-              </w:rPr>
-            </w:pPr>
-            <w:proofErr w:type="gramStart"/>
+            <w:tcW w:w="1366" w:type="dxa"/>
+            <w:hideMark/>
+          </w:tcPr>
+          <w:p>
+            <w:pPr>
+              <w:spacing w:after="160" w:line="278" w:lineRule="auto"/>
+              <w:rPr>
+                <w:sz w:val="22"/>
+                <w:szCs w:val="22"/>
+              </w:rPr>
+            </w:pPr>
             <w:r>
               <w:rPr>
                 <w:b/>
@@ -6022,9 +5782,23 @@
                 <w:sz w:val="22"/>
                 <w:szCs w:val="22"/>
               </w:rPr>
-              <w:t>Top-1</w:t>
-            </w:r>
-            <w:proofErr w:type="gramEnd"/>
+              <w:t>Top-1 Agreement</w:t>
+            </w:r>
+          </w:p>
+        </w:tc>
+        <w:tc>
+          <w:tcPr>
+            <w:tcW w:w="1182" w:type="dxa"/>
+            <w:hideMark/>
+          </w:tcPr>
+          <w:p>
+            <w:pPr>
+              <w:spacing w:after="160" w:line="278" w:lineRule="auto"/>
+              <w:rPr>
+                <w:sz w:val="22"/>
+                <w:szCs w:val="22"/>
+              </w:rPr>
+            </w:pPr>
             <w:r>
               <w:rPr>
                 <w:b/>
@@ -6032,13 +5806,13 @@
                 <w:sz w:val="22"/>
                 <w:szCs w:val="22"/>
               </w:rPr>
-              <w:t xml:space="preserve"> Agreement</w:t>
-            </w:r>
-          </w:p>
-        </w:tc>
-        <w:tc>
-          <w:tcPr>
-            <w:tcW w:w="0" w:type="auto"/>
+              <w:t>Memory Footprint</w:t>
+            </w:r>
+          </w:p>
+        </w:tc>
+        <w:tc>
+          <w:tcPr>
+            <w:tcW w:w="1269" w:type="dxa"/>
             <w:hideMark/>
           </w:tcPr>
           <w:p>
@@ -6056,31 +5830,31 @@
                 <w:sz w:val="22"/>
                 <w:szCs w:val="22"/>
               </w:rPr>
-              <w:t>Memory Footprint</w:t>
-            </w:r>
-          </w:p>
-        </w:tc>
-        <w:tc>
-          <w:tcPr>
-            <w:tcW w:w="0" w:type="auto"/>
-            <w:hideMark/>
-          </w:tcPr>
-          <w:p>
-            <w:pPr>
-              <w:spacing w:after="160" w:line="278" w:lineRule="auto"/>
-              <w:rPr>
-                <w:sz w:val="22"/>
-                <w:szCs w:val="22"/>
-              </w:rPr>
-            </w:pPr>
-            <w:r>
+              <w:t>Status</w:t>
+            </w:r>
+          </w:p>
+        </w:tc>
+        <w:tc>
+          <w:tcPr>
+            <w:tcW w:w="1916" w:type="dxa"/>
+          </w:tcPr>
+          <w:p>
+            <w:pPr>
               <w:rPr>
                 <w:b/>
                 <w:bCs/>
                 <w:sz w:val="22"/>
                 <w:szCs w:val="22"/>
               </w:rPr>
-              <w:t>Status</w:t>
+            </w:pPr>
+            <w:r>
+              <w:rPr>
+                <w:b/>
+                <w:bCs/>
+                <w:sz w:val="22"/>
+                <w:szCs w:val="22"/>
+              </w:rPr>
+              <w:t>Observed Audio Failure</w:t>
             </w:r>
           </w:p>
         </w:tc>
@@ -6088,7 +5862,7 @@
       <w:tr>
         <w:tc>
           <w:tcPr>
-            <w:tcW w:w="1129" w:type="dxa"/>
+            <w:tcW w:w="1550" w:type="dxa"/>
             <w:hideMark/>
           </w:tcPr>
           <w:p>
@@ -6112,7 +5886,7 @@
         </w:tc>
         <w:tc>
           <w:tcPr>
-            <w:tcW w:w="2064" w:type="dxa"/>
+            <w:tcW w:w="940" w:type="dxa"/>
             <w:hideMark/>
           </w:tcPr>
           <w:p>
@@ -6134,7 +5908,7 @@
         </w:tc>
         <w:tc>
           <w:tcPr>
-            <w:tcW w:w="0" w:type="auto"/>
+            <w:tcW w:w="986" w:type="dxa"/>
             <w:hideMark/>
           </w:tcPr>
           <w:p>
@@ -6156,7 +5930,7 @@
         </w:tc>
         <w:tc>
           <w:tcPr>
-            <w:tcW w:w="0" w:type="auto"/>
+            <w:tcW w:w="1366" w:type="dxa"/>
             <w:hideMark/>
           </w:tcPr>
           <w:p>
@@ -6178,7 +5952,7 @@
         </w:tc>
         <w:tc>
           <w:tcPr>
-            <w:tcW w:w="0" w:type="auto"/>
+            <w:tcW w:w="1182" w:type="dxa"/>
             <w:hideMark/>
           </w:tcPr>
           <w:p>
@@ -6200,7 +5974,7 @@
         </w:tc>
         <w:tc>
           <w:tcPr>
-            <w:tcW w:w="0" w:type="auto"/>
+            <w:tcW w:w="1269" w:type="dxa"/>
             <w:hideMark/>
           </w:tcPr>
           <w:p>
@@ -6217,6 +5991,26 @@
                 <w:szCs w:val="22"/>
               </w:rPr>
               <w:t>Reference</w:t>
+            </w:r>
+          </w:p>
+        </w:tc>
+        <w:tc>
+          <w:tcPr>
+            <w:tcW w:w="1916" w:type="dxa"/>
+          </w:tcPr>
+          <w:p>
+            <w:pPr>
+              <w:rPr>
+                <w:sz w:val="22"/>
+                <w:szCs w:val="22"/>
+              </w:rPr>
+            </w:pPr>
+            <w:r>
+              <w:rPr>
+                <w:sz w:val="22"/>
+                <w:szCs w:val="22"/>
+              </w:rPr>
+              <w:t>None — reference quality</w:t>
             </w:r>
           </w:p>
         </w:tc>
@@ -6224,7 +6018,7 @@
       <w:tr>
         <w:tc>
           <w:tcPr>
-            <w:tcW w:w="1129" w:type="dxa"/>
+            <w:tcW w:w="1550" w:type="dxa"/>
             <w:hideMark/>
           </w:tcPr>
           <w:p>
@@ -6248,7 +6042,7 @@
         </w:tc>
         <w:tc>
           <w:tcPr>
-            <w:tcW w:w="2064" w:type="dxa"/>
+            <w:tcW w:w="940" w:type="dxa"/>
             <w:hideMark/>
           </w:tcPr>
           <w:p>
@@ -6270,7 +6064,7 @@
         </w:tc>
         <w:tc>
           <w:tcPr>
-            <w:tcW w:w="0" w:type="auto"/>
+            <w:tcW w:w="986" w:type="dxa"/>
             <w:hideMark/>
           </w:tcPr>
           <w:p>
@@ -6292,7 +6086,7 @@
         </w:tc>
         <w:tc>
           <w:tcPr>
-            <w:tcW w:w="0" w:type="auto"/>
+            <w:tcW w:w="1366" w:type="dxa"/>
             <w:hideMark/>
           </w:tcPr>
           <w:p>
@@ -6314,7 +6108,7 @@
         </w:tc>
         <w:tc>
           <w:tcPr>
-            <w:tcW w:w="0" w:type="auto"/>
+            <w:tcW w:w="1182" w:type="dxa"/>
             <w:hideMark/>
           </w:tcPr>
           <w:p>
@@ -6357,7 +6151,7 @@
         </w:tc>
         <w:tc>
           <w:tcPr>
-            <w:tcW w:w="0" w:type="auto"/>
+            <w:tcW w:w="1269" w:type="dxa"/>
             <w:hideMark/>
           </w:tcPr>
           <w:p>
@@ -6374,6 +6168,26 @@
                 <w:szCs w:val="22"/>
               </w:rPr>
               <w:t>FAIL — acoustic collapse</w:t>
+            </w:r>
+          </w:p>
+        </w:tc>
+        <w:tc>
+          <w:tcPr>
+            <w:tcW w:w="1916" w:type="dxa"/>
+          </w:tcPr>
+          <w:p>
+            <w:pPr>
+              <w:rPr>
+                <w:sz w:val="22"/>
+                <w:szCs w:val="22"/>
+              </w:rPr>
+            </w:pPr>
+            <w:r>
+              <w:rPr>
+                <w:sz w:val="22"/>
+                <w:szCs w:val="22"/>
+              </w:rPr>
+              <w:t>Violent static and screaming audio</w:t>
             </w:r>
           </w:p>
         </w:tc>
@@ -6381,7 +6195,7 @@
       <w:tr>
         <w:tc>
           <w:tcPr>
-            <w:tcW w:w="1129" w:type="dxa"/>
+            <w:tcW w:w="1550" w:type="dxa"/>
             <w:hideMark/>
           </w:tcPr>
           <w:p>
@@ -6405,7 +6219,7 @@
         </w:tc>
         <w:tc>
           <w:tcPr>
-            <w:tcW w:w="2064" w:type="dxa"/>
+            <w:tcW w:w="940" w:type="dxa"/>
             <w:hideMark/>
           </w:tcPr>
           <w:p>
@@ -6427,7 +6241,7 @@
         </w:tc>
         <w:tc>
           <w:tcPr>
-            <w:tcW w:w="0" w:type="auto"/>
+            <w:tcW w:w="986" w:type="dxa"/>
             <w:hideMark/>
           </w:tcPr>
           <w:p>
@@ -6449,7 +6263,7 @@
         </w:tc>
         <w:tc>
           <w:tcPr>
-            <w:tcW w:w="0" w:type="auto"/>
+            <w:tcW w:w="1366" w:type="dxa"/>
             <w:hideMark/>
           </w:tcPr>
           <w:p>
@@ -6471,7 +6285,7 @@
         </w:tc>
         <w:tc>
           <w:tcPr>
-            <w:tcW w:w="0" w:type="auto"/>
+            <w:tcW w:w="1182" w:type="dxa"/>
             <w:hideMark/>
           </w:tcPr>
           <w:p>
@@ -6500,7 +6314,7 @@
         </w:tc>
         <w:tc>
           <w:tcPr>
-            <w:tcW w:w="0" w:type="auto"/>
+            <w:tcW w:w="1269" w:type="dxa"/>
             <w:hideMark/>
           </w:tcPr>
           <w:p>
@@ -6517,6 +6331,26 @@
                 <w:szCs w:val="22"/>
               </w:rPr>
               <w:t>FAIL — dictionary gibberish</w:t>
+            </w:r>
+          </w:p>
+        </w:tc>
+        <w:tc>
+          <w:tcPr>
+            <w:tcW w:w="1916" w:type="dxa"/>
+          </w:tcPr>
+          <w:p>
+            <w:pPr>
+              <w:rPr>
+                <w:sz w:val="22"/>
+                <w:szCs w:val="22"/>
+              </w:rPr>
+            </w:pPr>
+            <w:r>
+              <w:rPr>
+                <w:sz w:val="22"/>
+                <w:szCs w:val="22"/>
+              </w:rPr>
+              <w:t>Dictionary gibberish</w:t>
             </w:r>
           </w:p>
         </w:tc>
@@ -6524,7 +6358,7 @@
       <w:tr>
         <w:tc>
           <w:tcPr>
-            <w:tcW w:w="1129" w:type="dxa"/>
+            <w:tcW w:w="1550" w:type="dxa"/>
             <w:hideMark/>
           </w:tcPr>
           <w:p>
@@ -6588,7 +6422,7 @@
         </w:tc>
         <w:tc>
           <w:tcPr>
-            <w:tcW w:w="2064" w:type="dxa"/>
+            <w:tcW w:w="940" w:type="dxa"/>
             <w:hideMark/>
           </w:tcPr>
           <w:p>
@@ -6610,7 +6444,7 @@
         </w:tc>
         <w:tc>
           <w:tcPr>
-            <w:tcW w:w="0" w:type="auto"/>
+            <w:tcW w:w="986" w:type="dxa"/>
             <w:hideMark/>
           </w:tcPr>
           <w:p>
@@ -6632,7 +6466,7 @@
         </w:tc>
         <w:tc>
           <w:tcPr>
-            <w:tcW w:w="0" w:type="auto"/>
+            <w:tcW w:w="1366" w:type="dxa"/>
             <w:hideMark/>
           </w:tcPr>
           <w:p>
@@ -6654,7 +6488,7 @@
         </w:tc>
         <w:tc>
           <w:tcPr>
-            <w:tcW w:w="0" w:type="auto"/>
+            <w:tcW w:w="1182" w:type="dxa"/>
             <w:hideMark/>
           </w:tcPr>
           <w:p>
@@ -6676,7 +6510,7 @@
         </w:tc>
         <w:tc>
           <w:tcPr>
-            <w:tcW w:w="0" w:type="auto"/>
+            <w:tcW w:w="1269" w:type="dxa"/>
             <w:hideMark/>
           </w:tcPr>
           <w:p>
@@ -6693,6 +6527,26 @@
                 <w:szCs w:val="22"/>
               </w:rPr>
               <w:t>FAIL — logit scrambling</w:t>
+            </w:r>
+          </w:p>
+        </w:tc>
+        <w:tc>
+          <w:tcPr>
+            <w:tcW w:w="1916" w:type="dxa"/>
+          </w:tcPr>
+          <w:p>
+            <w:pPr>
+              <w:rPr>
+                <w:sz w:val="22"/>
+                <w:szCs w:val="22"/>
+              </w:rPr>
+            </w:pPr>
+            <w:r>
+              <w:rPr>
+                <w:sz w:val="22"/>
+                <w:szCs w:val="22"/>
+              </w:rPr>
+              <w:t>Superficially coherent, causally scrambled</w:t>
             </w:r>
           </w:p>
         </w:tc>
@@ -6700,7 +6554,7 @@
       <w:tr>
         <w:tc>
           <w:tcPr>
-            <w:tcW w:w="1129" w:type="dxa"/>
+            <w:tcW w:w="1550" w:type="dxa"/>
             <w:hideMark/>
           </w:tcPr>
           <w:p>
@@ -6718,13 +6572,14 @@
                 <w:sz w:val="22"/>
                 <w:szCs w:val="22"/>
               </w:rPr>
+              <w:lastRenderedPageBreak/>
               <w:t>LQEC Distillation</w:t>
             </w:r>
           </w:p>
         </w:tc>
         <w:tc>
           <w:tcPr>
-            <w:tcW w:w="2064" w:type="dxa"/>
+            <w:tcW w:w="940" w:type="dxa"/>
             <w:hideMark/>
           </w:tcPr>
           <w:p>
@@ -6746,7 +6601,7 @@
         </w:tc>
         <w:tc>
           <w:tcPr>
-            <w:tcW w:w="0" w:type="auto"/>
+            <w:tcW w:w="986" w:type="dxa"/>
             <w:hideMark/>
           </w:tcPr>
           <w:p>
@@ -6768,7 +6623,7 @@
         </w:tc>
         <w:tc>
           <w:tcPr>
-            <w:tcW w:w="0" w:type="auto"/>
+            <w:tcW w:w="1366" w:type="dxa"/>
             <w:hideMark/>
           </w:tcPr>
           <w:p>
@@ -6790,7 +6645,7 @@
         </w:tc>
         <w:tc>
           <w:tcPr>
-            <w:tcW w:w="0" w:type="auto"/>
+            <w:tcW w:w="1182" w:type="dxa"/>
             <w:hideMark/>
           </w:tcPr>
           <w:p>
@@ -6812,7 +6667,7 @@
         </w:tc>
         <w:tc>
           <w:tcPr>
-            <w:tcW w:w="0" w:type="auto"/>
+            <w:tcW w:w="1269" w:type="dxa"/>
             <w:hideMark/>
           </w:tcPr>
           <w:p>
@@ -6829,6 +6684,26 @@
                 <w:szCs w:val="22"/>
               </w:rPr>
               <w:t>FAIL — exposure bias</w:t>
+            </w:r>
+          </w:p>
+        </w:tc>
+        <w:tc>
+          <w:tcPr>
+            <w:tcW w:w="1916" w:type="dxa"/>
+          </w:tcPr>
+          <w:p>
+            <w:pPr>
+              <w:rPr>
+                <w:sz w:val="22"/>
+                <w:szCs w:val="22"/>
+              </w:rPr>
+            </w:pPr>
+            <w:r>
+              <w:rPr>
+                <w:sz w:val="22"/>
+                <w:szCs w:val="22"/>
+              </w:rPr>
+              <w:t>Coherent under teacher, collapsed in free generation</w:t>
             </w:r>
           </w:p>
         </w:tc>
@@ -6836,18 +6711,17 @@
       <w:tr>
         <w:tc>
           <w:tcPr>
-            <w:tcW w:w="1129" w:type="dxa"/>
-            <w:hideMark/>
-          </w:tcPr>
-          <w:p>
-            <w:pPr>
-              <w:spacing w:after="160" w:line="278" w:lineRule="auto"/>
-              <w:rPr>
-                <w:sz w:val="22"/>
-                <w:szCs w:val="22"/>
-              </w:rPr>
-            </w:pPr>
-            <w:proofErr w:type="spellStart"/>
+            <w:tcW w:w="1550" w:type="dxa"/>
+            <w:hideMark/>
+          </w:tcPr>
+          <w:p>
+            <w:pPr>
+              <w:spacing w:after="160" w:line="278" w:lineRule="auto"/>
+              <w:rPr>
+                <w:sz w:val="22"/>
+                <w:szCs w:val="22"/>
+              </w:rPr>
+            </w:pPr>
             <w:r>
               <w:rPr>
                 <w:b/>
@@ -6855,17 +6729,7 @@
                 <w:sz w:val="22"/>
                 <w:szCs w:val="22"/>
               </w:rPr>
-              <w:t>SliceGPT</w:t>
-            </w:r>
-            <w:proofErr w:type="spellEnd"/>
-            <w:r>
-              <w:rPr>
-                <w:b/>
-                <w:bCs/>
-                <w:sz w:val="22"/>
-                <w:szCs w:val="22"/>
-              </w:rPr>
-              <w:t xml:space="preserve"> (</w:t>
+              <w:t>SliceGPT (</w:t>
             </w:r>
             <m:oMath>
               <m:r>
@@ -6893,7 +6757,7 @@
         </w:tc>
         <w:tc>
           <w:tcPr>
-            <w:tcW w:w="2064" w:type="dxa"/>
+            <w:tcW w:w="940" w:type="dxa"/>
             <w:hideMark/>
           </w:tcPr>
           <w:p>
@@ -6929,7 +6793,7 @@
         </w:tc>
         <w:tc>
           <w:tcPr>
-            <w:tcW w:w="0" w:type="auto"/>
+            <w:tcW w:w="986" w:type="dxa"/>
             <w:hideMark/>
           </w:tcPr>
           <w:p>
@@ -6951,7 +6815,7 @@
         </w:tc>
         <w:tc>
           <w:tcPr>
-            <w:tcW w:w="0" w:type="auto"/>
+            <w:tcW w:w="1366" w:type="dxa"/>
             <w:hideMark/>
           </w:tcPr>
           <w:p>
@@ -6973,7 +6837,7 @@
         </w:tc>
         <w:tc>
           <w:tcPr>
-            <w:tcW w:w="0" w:type="auto"/>
+            <w:tcW w:w="1182" w:type="dxa"/>
             <w:hideMark/>
           </w:tcPr>
           <w:p>
@@ -6995,7 +6859,7 @@
         </w:tc>
         <w:tc>
           <w:tcPr>
-            <w:tcW w:w="0" w:type="auto"/>
+            <w:tcW w:w="1269" w:type="dxa"/>
             <w:hideMark/>
           </w:tcPr>
           <w:p>
@@ -7012,6 +6876,26 @@
                 <w:szCs w:val="22"/>
               </w:rPr>
               <w:t>FAIL — 4421x gain explosion</w:t>
+            </w:r>
+          </w:p>
+        </w:tc>
+        <w:tc>
+          <w:tcPr>
+            <w:tcW w:w="1916" w:type="dxa"/>
+          </w:tcPr>
+          <w:p>
+            <w:pPr>
+              <w:rPr>
+                <w:sz w:val="22"/>
+                <w:szCs w:val="22"/>
+              </w:rPr>
+            </w:pPr>
+            <w:r>
+              <w:rPr>
+                <w:sz w:val="22"/>
+                <w:szCs w:val="22"/>
+              </w:rPr>
+              <w:t>Token 260 fixation — complete vocabulary lock</w:t>
             </w:r>
           </w:p>
         </w:tc>
@@ -7019,7 +6903,7 @@
       <w:tr>
         <w:tc>
           <w:tcPr>
-            <w:tcW w:w="1129" w:type="dxa"/>
+            <w:tcW w:w="1550" w:type="dxa"/>
             <w:hideMark/>
           </w:tcPr>
           <w:p>
@@ -7043,17 +6927,24 @@
         </w:tc>
         <w:tc>
           <w:tcPr>
-            <w:tcW w:w="2064" w:type="dxa"/>
-            <w:hideMark/>
-          </w:tcPr>
-          <w:p>
-            <w:pPr>
-              <w:spacing w:after="160" w:line="278" w:lineRule="auto"/>
-              <w:rPr>
-                <w:sz w:val="22"/>
-                <w:szCs w:val="22"/>
-              </w:rPr>
-            </w:pPr>
+            <w:tcW w:w="940" w:type="dxa"/>
+            <w:hideMark/>
+          </w:tcPr>
+          <w:p>
+            <w:pPr>
+              <w:spacing w:after="160" w:line="278" w:lineRule="auto"/>
+              <w:rPr>
+                <w:sz w:val="22"/>
+                <w:szCs w:val="22"/>
+              </w:rPr>
+            </w:pPr>
+            <w:r>
+              <w:rPr>
+                <w:sz w:val="22"/>
+                <w:szCs w:val="22"/>
+              </w:rPr>
+              <w:t xml:space="preserve">~ </w:t>
+            </w:r>
             <w:r>
               <w:rPr>
                 <w:sz w:val="22"/>
@@ -7065,7 +6956,7 @@
         </w:tc>
         <w:tc>
           <w:tcPr>
-            <w:tcW w:w="0" w:type="auto"/>
+            <w:tcW w:w="986" w:type="dxa"/>
             <w:hideMark/>
           </w:tcPr>
           <w:p>
@@ -7087,7 +6978,7 @@
         </w:tc>
         <w:tc>
           <w:tcPr>
-            <w:tcW w:w="0" w:type="auto"/>
+            <w:tcW w:w="1366" w:type="dxa"/>
             <w:hideMark/>
           </w:tcPr>
           <w:p>
@@ -7109,7 +7000,7 @@
         </w:tc>
         <w:tc>
           <w:tcPr>
-            <w:tcW w:w="0" w:type="auto"/>
+            <w:tcW w:w="1182" w:type="dxa"/>
             <w:hideMark/>
           </w:tcPr>
           <w:p>
@@ -7131,7 +7022,7 @@
         </w:tc>
         <w:tc>
           <w:tcPr>
-            <w:tcW w:w="0" w:type="auto"/>
+            <w:tcW w:w="1269" w:type="dxa"/>
             <w:hideMark/>
           </w:tcPr>
           <w:p>
@@ -7163,9 +7054,6 @@
                 </m:sSubPr>
                 <m:e>
                   <m:r>
-                    <m:rPr>
-                      <m:sty m:val="p"/>
-                    </m:rPr>
                     <w:rPr>
                       <w:rFonts w:ascii="Cambria Math" w:hAnsi="Cambria Math"/>
                       <w:sz w:val="22"/>
@@ -7176,9 +7064,6 @@
                 </m:e>
                 <m:sub>
                   <m:r>
-                    <m:rPr>
-                      <m:sty m:val="p"/>
-                    </m:rPr>
                     <w:rPr>
                       <w:rFonts w:ascii="Cambria Math" w:hAnsi="Cambria Math"/>
                       <w:sz w:val="22"/>
@@ -7198,11 +7083,31 @@
             </w:r>
           </w:p>
         </w:tc>
+        <w:tc>
+          <w:tcPr>
+            <w:tcW w:w="1916" w:type="dxa"/>
+          </w:tcPr>
+          <w:p>
+            <w:pPr>
+              <w:rPr>
+                <w:sz w:val="22"/>
+                <w:szCs w:val="22"/>
+              </w:rPr>
+            </w:pPr>
+            <w:r>
+              <w:rPr>
+                <w:sz w:val="22"/>
+                <w:szCs w:val="22"/>
+              </w:rPr>
+              <w:t>Not evaluated — z_s abort</w:t>
+            </w:r>
+          </w:p>
+        </w:tc>
       </w:tr>
       <w:tr>
         <w:tc>
           <w:tcPr>
-            <w:tcW w:w="1129" w:type="dxa"/>
+            <w:tcW w:w="1550" w:type="dxa"/>
             <w:hideMark/>
           </w:tcPr>
           <w:p>
@@ -7226,17 +7131,24 @@
         </w:tc>
         <w:tc>
           <w:tcPr>
-            <w:tcW w:w="2064" w:type="dxa"/>
-            <w:hideMark/>
-          </w:tcPr>
-          <w:p>
-            <w:pPr>
-              <w:spacing w:after="160" w:line="278" w:lineRule="auto"/>
-              <w:rPr>
-                <w:sz w:val="22"/>
-                <w:szCs w:val="22"/>
-              </w:rPr>
-            </w:pPr>
+            <w:tcW w:w="940" w:type="dxa"/>
+            <w:hideMark/>
+          </w:tcPr>
+          <w:p>
+            <w:pPr>
+              <w:spacing w:after="160" w:line="278" w:lineRule="auto"/>
+              <w:rPr>
+                <w:sz w:val="22"/>
+                <w:szCs w:val="22"/>
+              </w:rPr>
+            </w:pPr>
+            <w:r>
+              <w:rPr>
+                <w:sz w:val="22"/>
+                <w:szCs w:val="22"/>
+              </w:rPr>
+              <w:t xml:space="preserve">~ </w:t>
+            </w:r>
             <w:r>
               <w:rPr>
                 <w:sz w:val="22"/>
@@ -7248,7 +7160,7 @@
         </w:tc>
         <w:tc>
           <w:tcPr>
-            <w:tcW w:w="0" w:type="auto"/>
+            <w:tcW w:w="986" w:type="dxa"/>
             <w:hideMark/>
           </w:tcPr>
           <w:p>
@@ -7270,7 +7182,7 @@
         </w:tc>
         <w:tc>
           <w:tcPr>
-            <w:tcW w:w="0" w:type="auto"/>
+            <w:tcW w:w="1366" w:type="dxa"/>
             <w:hideMark/>
           </w:tcPr>
           <w:p>
@@ -7292,7 +7204,7 @@
         </w:tc>
         <w:tc>
           <w:tcPr>
-            <w:tcW w:w="0" w:type="auto"/>
+            <w:tcW w:w="1182" w:type="dxa"/>
             <w:hideMark/>
           </w:tcPr>
           <w:p>
@@ -7321,7 +7233,7 @@
         </w:tc>
         <w:tc>
           <w:tcPr>
-            <w:tcW w:w="0" w:type="auto"/>
+            <w:tcW w:w="1269" w:type="dxa"/>
             <w:hideMark/>
           </w:tcPr>
           <w:p>
@@ -7338,6 +7250,26 @@
                 <w:szCs w:val="22"/>
               </w:rPr>
               <w:t>PARTIAL — over ceiling</w:t>
+            </w:r>
+          </w:p>
+        </w:tc>
+        <w:tc>
+          <w:tcPr>
+            <w:tcW w:w="1916" w:type="dxa"/>
+          </w:tcPr>
+          <w:p>
+            <w:pPr>
+              <w:rPr>
+                <w:sz w:val="22"/>
+                <w:szCs w:val="22"/>
+              </w:rPr>
+            </w:pPr>
+            <w:r>
+              <w:rPr>
+                <w:sz w:val="22"/>
+                <w:szCs w:val="22"/>
+              </w:rPr>
+              <w:t>Minor artefacts pre-QAT, clean post-QAT</w:t>
             </w:r>
           </w:p>
         </w:tc>
@@ -7345,7 +7277,7 @@
       <w:tr>
         <w:tc>
           <w:tcPr>
-            <w:tcW w:w="1129" w:type="dxa"/>
+            <w:tcW w:w="1550" w:type="dxa"/>
             <w:hideMark/>
           </w:tcPr>
           <w:p>
@@ -7369,17 +7301,24 @@
         </w:tc>
         <w:tc>
           <w:tcPr>
-            <w:tcW w:w="2064" w:type="dxa"/>
-            <w:hideMark/>
-          </w:tcPr>
-          <w:p>
-            <w:pPr>
-              <w:spacing w:after="160" w:line="278" w:lineRule="auto"/>
-              <w:rPr>
-                <w:sz w:val="22"/>
-                <w:szCs w:val="22"/>
-              </w:rPr>
-            </w:pPr>
+            <w:tcW w:w="940" w:type="dxa"/>
+            <w:hideMark/>
+          </w:tcPr>
+          <w:p>
+            <w:pPr>
+              <w:spacing w:after="160" w:line="278" w:lineRule="auto"/>
+              <w:rPr>
+                <w:sz w:val="22"/>
+                <w:szCs w:val="22"/>
+              </w:rPr>
+            </w:pPr>
+            <w:r>
+              <w:rPr>
+                <w:sz w:val="22"/>
+                <w:szCs w:val="22"/>
+              </w:rPr>
+              <w:t xml:space="preserve">~ </w:t>
+            </w:r>
             <w:r>
               <w:rPr>
                 <w:sz w:val="22"/>
@@ -7391,7 +7330,7 @@
         </w:tc>
         <w:tc>
           <w:tcPr>
-            <w:tcW w:w="0" w:type="auto"/>
+            <w:tcW w:w="986" w:type="dxa"/>
             <w:hideMark/>
           </w:tcPr>
           <w:p>
@@ -7413,7 +7352,7 @@
         </w:tc>
         <w:tc>
           <w:tcPr>
-            <w:tcW w:w="0" w:type="auto"/>
+            <w:tcW w:w="1366" w:type="dxa"/>
             <w:hideMark/>
           </w:tcPr>
           <w:p>
@@ -7435,7 +7374,7 @@
         </w:tc>
         <w:tc>
           <w:tcPr>
-            <w:tcW w:w="0" w:type="auto"/>
+            <w:tcW w:w="1182" w:type="dxa"/>
             <w:hideMark/>
           </w:tcPr>
           <w:p>
@@ -7457,7 +7396,7 @@
         </w:tc>
         <w:tc>
           <w:tcPr>
-            <w:tcW w:w="0" w:type="auto"/>
+            <w:tcW w:w="1269" w:type="dxa"/>
             <w:hideMark/>
           </w:tcPr>
           <w:p>
@@ -7474,6 +7413,26 @@
                 <w:szCs w:val="22"/>
               </w:rPr>
               <w:t>FAIL — QAT abort</w:t>
+            </w:r>
+          </w:p>
+        </w:tc>
+        <w:tc>
+          <w:tcPr>
+            <w:tcW w:w="1916" w:type="dxa"/>
+          </w:tcPr>
+          <w:p>
+            <w:pPr>
+              <w:rPr>
+                <w:sz w:val="22"/>
+                <w:szCs w:val="22"/>
+              </w:rPr>
+            </w:pPr>
+            <w:r>
+              <w:rPr>
+                <w:sz w:val="22"/>
+                <w:szCs w:val="22"/>
+              </w:rPr>
+              <w:t>Not evaluated — QAT abort</w:t>
             </w:r>
           </w:p>
         </w:tc>
@@ -7481,7 +7440,7 @@
       <w:tr>
         <w:tc>
           <w:tcPr>
-            <w:tcW w:w="1129" w:type="dxa"/>
+            <w:tcW w:w="1550" w:type="dxa"/>
             <w:hideMark/>
           </w:tcPr>
           <w:p>
@@ -7505,29 +7464,36 @@
         </w:tc>
         <w:tc>
           <w:tcPr>
-            <w:tcW w:w="2064" w:type="dxa"/>
-            <w:hideMark/>
-          </w:tcPr>
-          <w:p>
-            <w:pPr>
-              <w:spacing w:after="160" w:line="278" w:lineRule="auto"/>
-              <w:rPr>
-                <w:sz w:val="22"/>
-                <w:szCs w:val="22"/>
-              </w:rPr>
-            </w:pPr>
-            <w:r>
-              <w:rPr>
-                <w:sz w:val="22"/>
-                <w:szCs w:val="22"/>
-              </w:rPr>
-              <w:t>$\sim 5.72$</w:t>
-            </w:r>
-          </w:p>
-        </w:tc>
-        <w:tc>
-          <w:tcPr>
-            <w:tcW w:w="0" w:type="auto"/>
+            <w:tcW w:w="940" w:type="dxa"/>
+            <w:hideMark/>
+          </w:tcPr>
+          <w:p>
+            <w:pPr>
+              <w:spacing w:after="160" w:line="278" w:lineRule="auto"/>
+              <w:rPr>
+                <w:sz w:val="22"/>
+                <w:szCs w:val="22"/>
+              </w:rPr>
+            </w:pPr>
+            <w:r>
+              <w:rPr>
+                <w:sz w:val="22"/>
+                <w:szCs w:val="22"/>
+              </w:rPr>
+              <w:t>~</w:t>
+            </w:r>
+            <w:r>
+              <w:rPr>
+                <w:sz w:val="22"/>
+                <w:szCs w:val="22"/>
+              </w:rPr>
+              <w:t xml:space="preserve"> 5.72</w:t>
+            </w:r>
+          </w:p>
+        </w:tc>
+        <w:tc>
+          <w:tcPr>
+            <w:tcW w:w="986" w:type="dxa"/>
             <w:hideMark/>
           </w:tcPr>
           <w:p>
@@ -7549,7 +7515,7 @@
         </w:tc>
         <w:tc>
           <w:tcPr>
-            <w:tcW w:w="0" w:type="auto"/>
+            <w:tcW w:w="1366" w:type="dxa"/>
             <w:hideMark/>
           </w:tcPr>
           <w:p>
@@ -7571,23 +7537,23 @@
         </w:tc>
         <w:tc>
           <w:tcPr>
-            <w:tcW w:w="0" w:type="auto"/>
-            <w:hideMark/>
-          </w:tcPr>
-          <w:p>
-            <w:pPr>
-              <w:spacing w:after="160" w:line="278" w:lineRule="auto"/>
-              <w:rPr>
-                <w:sz w:val="22"/>
-                <w:szCs w:val="22"/>
-              </w:rPr>
-            </w:pPr>
-            <w:r>
-              <w:rPr>
-                <w:sz w:val="22"/>
-                <w:szCs w:val="22"/>
-              </w:rPr>
-              <w:t>5</w:t>
+            <w:tcW w:w="1182" w:type="dxa"/>
+            <w:hideMark/>
+          </w:tcPr>
+          <w:p>
+            <w:pPr>
+              <w:spacing w:after="160" w:line="278" w:lineRule="auto"/>
+              <w:rPr>
+                <w:sz w:val="22"/>
+                <w:szCs w:val="22"/>
+              </w:rPr>
+            </w:pPr>
+            <w:r>
+              <w:rPr>
+                <w:sz w:val="22"/>
+                <w:szCs w:val="22"/>
+              </w:rPr>
+              <w:t>7</w:t>
             </w:r>
             <w:r>
               <w:rPr>
@@ -7600,7 +7566,7 @@
         </w:tc>
         <w:tc>
           <w:tcPr>
-            <w:tcW w:w="0" w:type="auto"/>
+            <w:tcW w:w="1269" w:type="dxa"/>
             <w:hideMark/>
           </w:tcPr>
           <w:p>
@@ -7626,6 +7592,30 @@
                 <w:szCs w:val="22"/>
               </w:rPr>
               <w:t xml:space="preserve"> — C++ incomplete</w:t>
+            </w:r>
+          </w:p>
+        </w:tc>
+        <w:tc>
+          <w:tcPr>
+            <w:tcW w:w="1916" w:type="dxa"/>
+          </w:tcPr>
+          <w:p>
+            <w:pPr>
+              <w:rPr>
+                <w:b/>
+                <w:bCs/>
+                <w:sz w:val="22"/>
+                <w:szCs w:val="22"/>
+              </w:rPr>
+            </w:pPr>
+            <w:r>
+              <w:rPr>
+                <w:b/>
+                <w:bCs/>
+                <w:sz w:val="22"/>
+                <w:szCs w:val="22"/>
+              </w:rPr>
+              <w:t>Clean generation within viable envelope</w:t>
             </w:r>
           </w:p>
         </w:tc>
@@ -7634,11 +7624,7 @@
     <w:p/>
     <w:p>
       <w:r>
-        <w:t xml:space="preserve">The baseline standard approaches, including basic INT4, NF4, AWQ, and LQEC Distillation, universally failed to maintain acoustic integrity, primarily suffering from </w:t>
-      </w:r>
-      <w:r>
-        <w:lastRenderedPageBreak/>
-        <w:t>catastrophic degradation due to activation outliers. The introduction of the SEPTQ Config A achieved a theoretical 4.274 BPW but failed the baseline layer diagnostic. The Half Cushion Max v10 achieved a functional 5.72 BPW footprint at a median of 0.973 by explicitly filtering sensitive projection modules.</w:t>
+        <w:t>The baseline standard approaches, including basic INT4, NF4, AWQ, and LQEC Distillation, universally failed to maintain acoustic integrity, primarily suffering from catastrophic degradation due to activation outliers. The introduction of the SEPTQ Config A achieved a theoretical 4.274 BPW but failed the baseline layer diagnostic. The Half Cushion Max v10 achieved a functional 5.72 BPW footprint at a median of 0.973 by explicitly filtering sensitive projection modules.</w:t>
       </w:r>
     </w:p>
     <w:p>
@@ -7669,37 +7655,605 @@
       </w:r>
     </w:p>
     <w:p>
-      <w:r>
-        <w:t xml:space="preserve">[TABLE 3 — v11 Layer-by-Layer </w:t>
-      </w:r>
-      <w:proofErr w:type="spellStart"/>
-      <w:r>
-        <w:t>z_s</w:t>
-      </w:r>
-      <w:proofErr w:type="spellEnd"/>
-      <w:r>
-        <w:t xml:space="preserve"> Cosine Collapse: Columns: Layer Index, </w:t>
-      </w:r>
-      <w:proofErr w:type="spellStart"/>
-      <w:r>
-        <w:t>z_s</w:t>
-      </w:r>
-      <w:proofErr w:type="spellEnd"/>
-      <w:r>
-        <w:t xml:space="preserve"> Cosine Similarity, Status. Rows for layers 00 through 31 with the recorded collapse values, plus a final row showing the network overall score of 0.894 and QAT abort status.]</w:t>
+      <w:pPr>
+        <w:pStyle w:val="Caption"/>
+        <w:keepNext/>
+        <w:jc w:val="center"/>
+        <w:rPr>
+          <w:rFonts w:eastAsiaTheme="minorEastAsia"/>
+        </w:rPr>
+      </w:pPr>
+      <w:r>
+        <w:t xml:space="preserve">Table </w:t>
+      </w:r>
+      <w:r>
+        <w:fldChar w:fldCharType="begin"/>
+      </w:r>
+      <w:r>
+        <w:instrText xml:space="preserve"> SEQ Table \* ARABIC </w:instrText>
+      </w:r>
+      <w:r>
+        <w:fldChar w:fldCharType="separate"/>
+      </w:r>
+      <w:r>
+        <w:rPr>
+          <w:noProof/>
+        </w:rPr>
+        <w:t>3</w:t>
+      </w:r>
+      <w:r>
+        <w:fldChar w:fldCharType="end"/>
+      </w:r>
+      <w:r>
+        <w:t xml:space="preserve">  </w:t>
+      </w:r>
+      <w:r>
+        <w:t xml:space="preserve">v11 Layer-by-Layer </w:t>
+      </w:r>
+      <m:oMath>
+        <m:sSub>
+          <m:sSubPr>
+            <m:ctrlPr>
+              <w:rPr>
+                <w:rFonts w:ascii="Cambria Math" w:hAnsi="Cambria Math"/>
+              </w:rPr>
+            </m:ctrlPr>
+          </m:sSubPr>
+          <m:e>
+            <m:r>
+              <w:rPr>
+                <w:rFonts w:ascii="Cambria Math" w:hAnsi="Cambria Math"/>
+              </w:rPr>
+              <m:t>z</m:t>
+            </m:r>
+          </m:e>
+          <m:sub>
+            <m:r>
+              <w:rPr>
+                <w:rFonts w:ascii="Cambria Math" w:hAnsi="Cambria Math"/>
+              </w:rPr>
+              <m:t>s</m:t>
+            </m:r>
+          </m:sub>
+        </m:sSub>
+      </m:oMath>
+      <w:r>
+        <w:t xml:space="preserve"> Cosine Collapse</w:t>
+      </w:r>
+    </w:p>
+    <w:tbl>
+      <w:tblPr>
+        <w:tblStyle w:val="TableGridLight"/>
+        <w:tblW w:w="0" w:type="auto"/>
+        <w:jc w:val="center"/>
+        <w:tblLook w:val="04A0" w:firstRow="1" w:lastRow="0" w:firstColumn="1" w:lastColumn="0" w:noHBand="0" w:noVBand="1"/>
+      </w:tblPr>
+      <w:tblGrid>
+        <w:gridCol w:w="2044"/>
+        <w:gridCol w:w="1337"/>
+        <w:gridCol w:w="2563"/>
+      </w:tblGrid>
+      <w:tr>
+        <w:trPr>
+          <w:jc w:val="center"/>
+        </w:trPr>
+        <w:tc>
+          <w:tcPr>
+            <w:tcW w:w="0" w:type="auto"/>
+            <w:hideMark/>
+          </w:tcPr>
+          <w:p>
+            <w:pPr>
+              <w:spacing w:after="160" w:line="278" w:lineRule="auto"/>
+            </w:pPr>
+            <w:r>
+              <w:rPr>
+                <w:b/>
+                <w:bCs/>
+              </w:rPr>
+              <w:t>Layer</w:t>
+            </w:r>
+          </w:p>
+        </w:tc>
+        <w:tc>
+          <w:tcPr>
+            <w:tcW w:w="0" w:type="auto"/>
+            <w:hideMark/>
+          </w:tcPr>
+          <w:p>
+            <w:pPr>
+              <w:spacing w:after="160" w:line="278" w:lineRule="auto"/>
+            </w:pPr>
+            <w:r>
+              <w:rPr>
+                <w:b/>
+                <w:bCs/>
+              </w:rPr>
+              <w:t>zs​ Cosine</w:t>
+            </w:r>
+          </w:p>
+        </w:tc>
+        <w:tc>
+          <w:tcPr>
+            <w:tcW w:w="0" w:type="auto"/>
+            <w:hideMark/>
+          </w:tcPr>
+          <w:p>
+            <w:pPr>
+              <w:spacing w:after="160" w:line="278" w:lineRule="auto"/>
+            </w:pPr>
+            <w:r>
+              <w:rPr>
+                <w:b/>
+                <w:bCs/>
+              </w:rPr>
+              <w:t>Status</w:t>
+            </w:r>
+          </w:p>
+        </w:tc>
+      </w:tr>
+      <w:tr>
+        <w:trPr>
+          <w:jc w:val="center"/>
+        </w:trPr>
+        <w:tc>
+          <w:tcPr>
+            <w:tcW w:w="0" w:type="auto"/>
+            <w:hideMark/>
+          </w:tcPr>
+          <w:p>
+            <w:pPr>
+              <w:spacing w:after="160" w:line="278" w:lineRule="auto"/>
+            </w:pPr>
+            <w:r>
+              <w:rPr>
+                <w:b/>
+                <w:bCs/>
+              </w:rPr>
+              <w:t>00</w:t>
+            </w:r>
+          </w:p>
+        </w:tc>
+        <w:tc>
+          <w:tcPr>
+            <w:tcW w:w="0" w:type="auto"/>
+            <w:hideMark/>
+          </w:tcPr>
+          <w:p>
+            <w:pPr>
+              <w:spacing w:after="160" w:line="278" w:lineRule="auto"/>
+            </w:pPr>
+            <w:r>
+              <w:t>0.999</w:t>
+            </w:r>
+          </w:p>
+        </w:tc>
+        <w:tc>
+          <w:tcPr>
+            <w:tcW w:w="0" w:type="auto"/>
+            <w:hideMark/>
+          </w:tcPr>
+          <w:p>
+            <w:pPr>
+              <w:spacing w:after="160" w:line="278" w:lineRule="auto"/>
+            </w:pPr>
+            <w:r>
+              <w:t>Stable</w:t>
+            </w:r>
+          </w:p>
+        </w:tc>
+      </w:tr>
+      <w:tr>
+        <w:trPr>
+          <w:jc w:val="center"/>
+        </w:trPr>
+        <w:tc>
+          <w:tcPr>
+            <w:tcW w:w="0" w:type="auto"/>
+            <w:hideMark/>
+          </w:tcPr>
+          <w:p>
+            <w:pPr>
+              <w:spacing w:after="160" w:line="278" w:lineRule="auto"/>
+            </w:pPr>
+            <w:r>
+              <w:rPr>
+                <w:b/>
+                <w:bCs/>
+              </w:rPr>
+              <w:t>01</w:t>
+            </w:r>
+          </w:p>
+        </w:tc>
+        <w:tc>
+          <w:tcPr>
+            <w:tcW w:w="0" w:type="auto"/>
+            <w:hideMark/>
+          </w:tcPr>
+          <w:p>
+            <w:pPr>
+              <w:spacing w:after="160" w:line="278" w:lineRule="auto"/>
+            </w:pPr>
+            <w:r>
+              <w:t>0.999</w:t>
+            </w:r>
+          </w:p>
+        </w:tc>
+        <w:tc>
+          <w:tcPr>
+            <w:tcW w:w="0" w:type="auto"/>
+            <w:hideMark/>
+          </w:tcPr>
+          <w:p>
+            <w:pPr>
+              <w:spacing w:after="160" w:line="278" w:lineRule="auto"/>
+            </w:pPr>
+            <w:r>
+              <w:t>Stable</w:t>
+            </w:r>
+          </w:p>
+        </w:tc>
+      </w:tr>
+      <w:tr>
+        <w:trPr>
+          <w:jc w:val="center"/>
+        </w:trPr>
+        <w:tc>
+          <w:tcPr>
+            <w:tcW w:w="0" w:type="auto"/>
+            <w:hideMark/>
+          </w:tcPr>
+          <w:p>
+            <w:pPr>
+              <w:spacing w:after="160" w:line="278" w:lineRule="auto"/>
+            </w:pPr>
+            <w:r>
+              <w:rPr>
+                <w:b/>
+                <w:bCs/>
+              </w:rPr>
+              <w:t>03</w:t>
+            </w:r>
+          </w:p>
+        </w:tc>
+        <w:tc>
+          <w:tcPr>
+            <w:tcW w:w="0" w:type="auto"/>
+            <w:hideMark/>
+          </w:tcPr>
+          <w:p>
+            <w:pPr>
+              <w:spacing w:after="160" w:line="278" w:lineRule="auto"/>
+            </w:pPr>
+            <w:r>
+              <w:t>0.983</w:t>
+            </w:r>
+          </w:p>
+        </w:tc>
+        <w:tc>
+          <w:tcPr>
+            <w:tcW w:w="0" w:type="auto"/>
+            <w:hideMark/>
+          </w:tcPr>
+          <w:p>
+            <w:pPr>
+              <w:spacing w:after="160" w:line="278" w:lineRule="auto"/>
+            </w:pPr>
+            <w:r>
+              <w:t>Onset of Degradation</w:t>
+            </w:r>
+          </w:p>
+        </w:tc>
+      </w:tr>
+      <w:tr>
+        <w:trPr>
+          <w:jc w:val="center"/>
+        </w:trPr>
+        <w:tc>
+          <w:tcPr>
+            <w:tcW w:w="0" w:type="auto"/>
+            <w:hideMark/>
+          </w:tcPr>
+          <w:p>
+            <w:pPr>
+              <w:spacing w:after="160" w:line="278" w:lineRule="auto"/>
+            </w:pPr>
+            <w:r>
+              <w:rPr>
+                <w:b/>
+                <w:bCs/>
+              </w:rPr>
+              <w:t>20</w:t>
+            </w:r>
+          </w:p>
+        </w:tc>
+        <w:tc>
+          <w:tcPr>
+            <w:tcW w:w="0" w:type="auto"/>
+            <w:hideMark/>
+          </w:tcPr>
+          <w:p>
+            <w:pPr>
+              <w:spacing w:after="160" w:line="278" w:lineRule="auto"/>
+            </w:pPr>
+            <w:r>
+              <w:t>0.708</w:t>
+            </w:r>
+          </w:p>
+        </w:tc>
+        <w:tc>
+          <w:tcPr>
+            <w:tcW w:w="0" w:type="auto"/>
+            <w:hideMark/>
+          </w:tcPr>
+          <w:p>
+            <w:pPr>
+              <w:spacing w:after="160" w:line="278" w:lineRule="auto"/>
+            </w:pPr>
+            <w:r>
+              <w:t>Severe Drift</w:t>
+            </w:r>
+          </w:p>
+        </w:tc>
+      </w:tr>
+      <w:tr>
+        <w:trPr>
+          <w:jc w:val="center"/>
+        </w:trPr>
+        <w:tc>
+          <w:tcPr>
+            <w:tcW w:w="0" w:type="auto"/>
+            <w:hideMark/>
+          </w:tcPr>
+          <w:p>
+            <w:pPr>
+              <w:spacing w:after="160" w:line="278" w:lineRule="auto"/>
+            </w:pPr>
+            <w:r>
+              <w:rPr>
+                <w:b/>
+                <w:bCs/>
+              </w:rPr>
+              <w:lastRenderedPageBreak/>
+              <w:t>26</w:t>
+            </w:r>
+          </w:p>
+        </w:tc>
+        <w:tc>
+          <w:tcPr>
+            <w:tcW w:w="0" w:type="auto"/>
+            <w:hideMark/>
+          </w:tcPr>
+          <w:p>
+            <w:pPr>
+              <w:spacing w:after="160" w:line="278" w:lineRule="auto"/>
+            </w:pPr>
+            <w:r>
+              <w:t>0.647</w:t>
+            </w:r>
+          </w:p>
+        </w:tc>
+        <w:tc>
+          <w:tcPr>
+            <w:tcW w:w="0" w:type="auto"/>
+            <w:hideMark/>
+          </w:tcPr>
+          <w:p>
+            <w:pPr>
+              <w:spacing w:after="160" w:line="278" w:lineRule="auto"/>
+            </w:pPr>
+            <w:r>
+              <w:t>Catastrophic Failure</w:t>
+            </w:r>
+          </w:p>
+        </w:tc>
+      </w:tr>
+      <w:tr>
+        <w:trPr>
+          <w:jc w:val="center"/>
+        </w:trPr>
+        <w:tc>
+          <w:tcPr>
+            <w:tcW w:w="0" w:type="auto"/>
+            <w:hideMark/>
+          </w:tcPr>
+          <w:p>
+            <w:pPr>
+              <w:spacing w:after="160" w:line="278" w:lineRule="auto"/>
+            </w:pPr>
+            <w:r>
+              <w:rPr>
+                <w:b/>
+                <w:bCs/>
+              </w:rPr>
+              <w:t>31</w:t>
+            </w:r>
+          </w:p>
+        </w:tc>
+        <w:tc>
+          <w:tcPr>
+            <w:tcW w:w="0" w:type="auto"/>
+            <w:hideMark/>
+          </w:tcPr>
+          <w:p>
+            <w:pPr>
+              <w:spacing w:after="160" w:line="278" w:lineRule="auto"/>
+            </w:pPr>
+            <w:r>
+              <w:t>0.686525</w:t>
+            </w:r>
+          </w:p>
+        </w:tc>
+        <w:tc>
+          <w:tcPr>
+            <w:tcW w:w="0" w:type="auto"/>
+            <w:hideMark/>
+          </w:tcPr>
+          <w:p>
+            <w:pPr>
+              <w:spacing w:after="160" w:line="278" w:lineRule="auto"/>
+            </w:pPr>
+            <w:r>
+              <w:t>Terminal Collapse</w:t>
+            </w:r>
+          </w:p>
+        </w:tc>
+      </w:tr>
+      <w:tr>
+        <w:trPr>
+          <w:jc w:val="center"/>
+        </w:trPr>
+        <w:tc>
+          <w:tcPr>
+            <w:tcW w:w="0" w:type="auto"/>
+            <w:hideMark/>
+          </w:tcPr>
+          <w:p>
+            <w:pPr>
+              <w:spacing w:after="160" w:line="278" w:lineRule="auto"/>
+            </w:pPr>
+            <w:r>
+              <w:rPr>
+                <w:b/>
+                <w:bCs/>
+              </w:rPr>
+              <w:t>Network Overall</w:t>
+            </w:r>
+          </w:p>
+        </w:tc>
+        <w:tc>
+          <w:tcPr>
+            <w:tcW w:w="0" w:type="auto"/>
+            <w:hideMark/>
+          </w:tcPr>
+          <w:p>
+            <w:pPr>
+              <w:spacing w:after="160" w:line="278" w:lineRule="auto"/>
+            </w:pPr>
+            <w:r>
+              <w:rPr>
+                <w:b/>
+                <w:bCs/>
+              </w:rPr>
+              <w:t>0.894</w:t>
+            </w:r>
+          </w:p>
+        </w:tc>
+        <w:tc>
+          <w:tcPr>
+            <w:tcW w:w="0" w:type="auto"/>
+            <w:hideMark/>
+          </w:tcPr>
+          <w:p>
+            <w:pPr>
+              <w:spacing w:after="160" w:line="278" w:lineRule="auto"/>
+            </w:pPr>
+            <w:r>
+              <w:rPr>
+                <w:b/>
+                <w:bCs/>
+              </w:rPr>
+              <w:t>QAT Abort Triggered</w:t>
+            </w:r>
+          </w:p>
+        </w:tc>
+      </w:tr>
+    </w:tbl>
+    <w:p/>
+    <w:p>
+      <w:pPr>
+        <w:keepNext/>
+      </w:pPr>
+      <w:r>
+        <w:rPr>
+          <w:noProof/>
+        </w:rPr>
+        <w:drawing>
+          <wp:inline distT="0" distB="0" distL="0" distR="0" wp14:anchorId="448A4DDE" wp14:editId="29CD1C96">
+            <wp:extent cx="5731510" cy="2653068"/>
+            <wp:effectExtent l="0" t="0" r="2540" b="0"/>
+            <wp:docPr id="2005551627" name="Picture 6"/>
+            <wp:cNvGraphicFramePr>
+              <a:graphicFrameLocks xmlns:a="http://schemas.openxmlformats.org/drawingml/2006/main" noChangeAspect="1"/>
+            </wp:cNvGraphicFramePr>
+            <a:graphic xmlns:a="http://schemas.openxmlformats.org/drawingml/2006/main">
+              <a:graphicData uri="http://schemas.openxmlformats.org/drawingml/2006/picture">
+                <pic:pic xmlns:pic="http://schemas.openxmlformats.org/drawingml/2006/picture">
+                  <pic:nvPicPr>
+                    <pic:cNvPr id="0" name="Picture 17"/>
+                    <pic:cNvPicPr>
+                      <a:picLocks noChangeAspect="1" noChangeArrowheads="1"/>
+                    </pic:cNvPicPr>
+                  </pic:nvPicPr>
+                  <pic:blipFill rotWithShape="1">
+                    <a:blip r:embed="rId13" cstate="print">
+                      <a:extLst>
+                        <a:ext uri="{28A0092B-C50C-407E-A947-70E740481C1C}">
+                          <a14:useLocalDpi xmlns:a14="http://schemas.microsoft.com/office/drawing/2010/main" val="0"/>
+                        </a:ext>
+                      </a:extLst>
+                    </a:blip>
+                    <a:srcRect t="6594"/>
+                    <a:stretch>
+                      <a:fillRect/>
+                    </a:stretch>
+                  </pic:blipFill>
+                  <pic:spPr bwMode="auto">
+                    <a:xfrm>
+                      <a:off x="0" y="0"/>
+                      <a:ext cx="5731510" cy="2653068"/>
+                    </a:xfrm>
+                    <a:prstGeom prst="rect">
+                      <a:avLst/>
+                    </a:prstGeom>
+                    <a:noFill/>
+                    <a:ln>
+                      <a:noFill/>
+                    </a:ln>
+                    <a:extLst>
+                      <a:ext uri="{53640926-AAD7-44D8-BBD7-CCE9431645EC}">
+                        <a14:shadowObscured xmlns:a14="http://schemas.microsoft.com/office/drawing/2010/main"/>
+                      </a:ext>
+                    </a:extLst>
+                  </pic:spPr>
+                </pic:pic>
+              </a:graphicData>
+            </a:graphic>
+          </wp:inline>
+        </w:drawing>
       </w:r>
     </w:p>
     <w:p>
-      <w:r>
-        <w:t xml:space="preserve">[FIGURE 5 — v11 Cosine Cascade: Line graph with layer index on x-axis and </w:t>
-      </w:r>
-      <w:proofErr w:type="spellStart"/>
-      <w:r>
-        <w:t>z_s</w:t>
-      </w:r>
-      <w:proofErr w:type="spellEnd"/>
-      <w:r>
-        <w:t xml:space="preserve"> cosine similarity on y-axis plotting the collapse from Layer 00 (0.999) to Layer 31 (0.686525). Include horizontal red dashed lines at 0.997 (production threshold) and 0.90 (QAT abort threshold).]</w:t>
+      <w:pPr>
+        <w:pStyle w:val="Caption"/>
+        <w:jc w:val="center"/>
+      </w:pPr>
+      <w:r>
+        <w:t xml:space="preserve">Figure </w:t>
+      </w:r>
+      <w:r>
+        <w:fldChar w:fldCharType="begin"/>
+      </w:r>
+      <w:r>
+        <w:instrText xml:space="preserve"> SEQ Figure \* ARABIC </w:instrText>
+      </w:r>
+      <w:r>
+        <w:fldChar w:fldCharType="separate"/>
+      </w:r>
+      <w:r>
+        <w:rPr>
+          <w:noProof/>
+        </w:rPr>
+        <w:t>6</w:t>
+      </w:r>
+      <w:r>
+        <w:fldChar w:fldCharType="end"/>
+      </w:r>
+      <w:r>
+        <w:t xml:space="preserve"> </w:t>
+      </w:r>
+      <w:r>
+        <w:t>v11 Cosine Cascade</w:t>
       </w:r>
     </w:p>
     <w:p>
@@ -7787,15 +8341,7 @@
         <w:t xml:space="preserve"> </w:t>
       </w:r>
       <w:r>
-        <w:t xml:space="preserve">drift metric was </w:t>
-      </w:r>
-      <w:proofErr w:type="gramStart"/>
-      <w:r>
-        <w:t>absolutely necessary</w:t>
-      </w:r>
-      <w:proofErr w:type="gramEnd"/>
-      <w:r>
-        <w:t xml:space="preserve"> because it isolated and quantified these micro-fractures in the latent state before layer-norm operators could artificially smooth the variance, an insight standard perplexity metrics entirely obscure.</w:t>
+        <w:t>drift metric was absolutely necessary because it isolated and quantified these micro-fractures in the latent state before layer-norm operators could artificially smooth the variance, an insight standard perplexity metrics entirely obscure.</w:t>
       </w:r>
     </w:p>
     <w:p>
@@ -7808,11 +8354,11 @@
     </w:p>
     <w:p>
       <w:r>
-        <w:t xml:space="preserve">A critical analysis of the empirical data reveals deep architectural characteristics inherent to continuous speech foundation models. The identification of 40x to 66x activation outliers explicitly demonstrates that Moshi-family architectures distribute semantic and acoustic routing entirely differently than standard transformer quantization literature. These immense magnitude spikes suggest that the network </w:t>
+        <w:t xml:space="preserve">A critical analysis of the empirical data reveals deep architectural characteristics inherent to continuous speech foundation models. The identification of 40x to 66x activation outliers explicitly demonstrates that Moshi-family architectures distribute semantic and acoustic routing entirely differently than standard transformer </w:t>
       </w:r>
       <w:r>
         <w:lastRenderedPageBreak/>
-        <w:t>encodes critical prosodic switches in highly localized, high-amplitude bursts that are instantly destroyed by uniform bit-width reduction.</w:t>
+        <w:t>quantization literature. These immense magnitude spikes suggest that the network encodes critical prosodic switches in highly localized, high-amplitude bursts that are instantly destroyed by uniform bit-width reduction.</w:t>
       </w:r>
     </w:p>
     <w:p>
@@ -7844,126 +8390,134 @@
         </m:r>
       </m:oMath>
       <w:r>
-        <w:t xml:space="preserve"> demand-paging behaviour. Model weights </w:t>
-      </w:r>
-      <w:proofErr w:type="gramStart"/>
-      <w:r>
-        <w:t>are fully materialized</w:t>
-      </w:r>
-      <w:proofErr w:type="gramEnd"/>
-      <w:r>
-        <w:t xml:space="preserve"> into allocated host memory pools during loading, with Jetson builds additionally using pinned host memory for CUDA streaming. As a result, total resident memory usage is determined by the loaded weights, KV cache allocation, graph work buffers, and CUDA resources rather than idealized on-demand paging.</w:t>
+        <w:t xml:space="preserve"> demand-paging behaviour. Model weights are fully materialized into allocated host memory pools during loading, with Jetson builds additionally using pinned host memory for CUDA streaming. As a result, total resident memory usage is determined by the loaded weights, KV cache allocation, graph work buffers, and CUDA resources rather than idealized on-demand paging.</w:t>
       </w:r>
     </w:p>
     <w:p>
       <w:r>
-        <w:t xml:space="preserve">The temporal KV cache is explicitly allocated in FP16 host memory and scaled by context length and layer count, with Jetson builds currently capping </w:t>
-      </w:r>
-      <w:proofErr w:type="spellStart"/>
-      <w:r>
-        <w:t>n_ctx</w:t>
-      </w:r>
-      <w:proofErr w:type="spellEnd"/>
-      <w:r>
-        <w:t xml:space="preserve"> at 1024 to remain within the unified-memory budget. In addition, graph execution depends on a fixed </w:t>
-      </w:r>
-      <w:proofErr w:type="spellStart"/>
-      <w:r>
-        <w:t>ggml</w:t>
-      </w:r>
-      <w:proofErr w:type="spellEnd"/>
-      <w:r>
-        <w:t xml:space="preserve"> work arena (1 GiB on Jetson builds). Exceeding this arena can still trigger allocation failures, meaning deployment stability is now primarily limited by work-buffer capacity and overall memory budgeting rather than operating system paging behaviour</w:t>
-      </w:r>
-      <w:r>
-        <w:t xml:space="preserve"> </w:t>
+        <w:t>The temporal KV cache is explicitly allocated in FP16 host memory and scaled by context length and layer count, with Jetson builds currently capping n_ctx at 1024 to remain within the unified-memory budget. In addition, graph execution depends on a fixed ggml work arena (1 GiB on Jetson builds). Exceeding this arena can still trigger allocation failures, meaning deployment stability is now primarily limited by work-buffer capacity and overall memory budgeting rather than operating system paging behaviour</w:t>
+      </w:r>
+      <w:r>
+        <w:t>.</w:t>
       </w:r>
     </w:p>
     <w:p>
-      <w:r>
-        <w:t>[</w:t>
-      </w:r>
-      <w:r>
-        <w:t>F</w:t>
-      </w:r>
-      <w:r>
-        <w:t xml:space="preserve">igure 6 — RSS and allocation components (current loader, not lazy weight </w:t>
-      </w:r>
-      <w:proofErr w:type="spellStart"/>
-      <w:r>
-        <w:t>mmap</w:t>
-      </w:r>
-      <w:proofErr w:type="spellEnd"/>
-      <w:r>
-        <w:t>): schematic time series of resident set size showing dominant contributions from (</w:t>
-      </w:r>
-      <w:proofErr w:type="spellStart"/>
-      <w:r>
-        <w:t>i</w:t>
-      </w:r>
-      <w:proofErr w:type="spellEnd"/>
-      <w:r>
-        <w:t xml:space="preserve">) fully loaded GGUF tensor pools (scalar + big), (ii) FP16 temporal KV proportional to </w:t>
-      </w:r>
-      <w:proofErr w:type="spellStart"/>
-      <w:r>
-        <w:t>n_ctx</w:t>
-      </w:r>
-      <w:proofErr w:type="spellEnd"/>
-      <w:r>
-        <w:t xml:space="preserve"> (Jetson-capped at 1024 in-tree), (iii) depth KV (small), (iv) the fixed </w:t>
-      </w:r>
-      <w:proofErr w:type="spellStart"/>
-      <w:r>
-        <w:t>ggml</w:t>
-      </w:r>
-      <w:proofErr w:type="spellEnd"/>
-      <w:r>
-        <w:t xml:space="preserve"> work arena (1 GiB Jetson / 2 GiB default host), and (v) CUDA staging / registered buffers, against the device’s physical RAM ceiling. The curve is not an on-demand page-in model for weights in the current implementation</w:t>
-      </w:r>
-      <w:r>
-        <w:t>]</w:t>
+      <w:pPr>
+        <w:keepNext/>
+        <w:jc w:val="center"/>
+      </w:pPr>
+      <w:r>
+        <w:rPr>
+          <w:noProof/>
+        </w:rPr>
+        <w:drawing>
+          <wp:inline distT="0" distB="0" distL="0" distR="0" wp14:anchorId="4827FDBA" wp14:editId="0A75E618">
+            <wp:extent cx="5731510" cy="2666321"/>
+            <wp:effectExtent l="0" t="0" r="2540" b="1270"/>
+            <wp:docPr id="1679317734" name="Picture 8"/>
+            <wp:cNvGraphicFramePr>
+              <a:graphicFrameLocks xmlns:a="http://schemas.openxmlformats.org/drawingml/2006/main" noChangeAspect="1"/>
+            </wp:cNvGraphicFramePr>
+            <a:graphic xmlns:a="http://schemas.openxmlformats.org/drawingml/2006/main">
+              <a:graphicData uri="http://schemas.openxmlformats.org/drawingml/2006/picture">
+                <pic:pic xmlns:pic="http://schemas.openxmlformats.org/drawingml/2006/picture">
+                  <pic:nvPicPr>
+                    <pic:cNvPr id="0" name="Picture 21"/>
+                    <pic:cNvPicPr>
+                      <a:picLocks noChangeAspect="1" noChangeArrowheads="1"/>
+                    </pic:cNvPicPr>
+                  </pic:nvPicPr>
+                  <pic:blipFill rotWithShape="1">
+                    <a:blip r:embed="rId14" cstate="print">
+                      <a:extLst>
+                        <a:ext uri="{28A0092B-C50C-407E-A947-70E740481C1C}">
+                          <a14:useLocalDpi xmlns:a14="http://schemas.microsoft.com/office/drawing/2010/main" val="0"/>
+                        </a:ext>
+                      </a:extLst>
+                    </a:blip>
+                    <a:srcRect t="6232"/>
+                    <a:stretch>
+                      <a:fillRect/>
+                    </a:stretch>
+                  </pic:blipFill>
+                  <pic:spPr bwMode="auto">
+                    <a:xfrm>
+                      <a:off x="0" y="0"/>
+                      <a:ext cx="5731510" cy="2666321"/>
+                    </a:xfrm>
+                    <a:prstGeom prst="rect">
+                      <a:avLst/>
+                    </a:prstGeom>
+                    <a:noFill/>
+                    <a:ln>
+                      <a:noFill/>
+                    </a:ln>
+                    <a:extLst>
+                      <a:ext uri="{53640926-AAD7-44D8-BBD7-CCE9431645EC}">
+                        <a14:shadowObscured xmlns:a14="http://schemas.microsoft.com/office/drawing/2010/main"/>
+                      </a:ext>
+                    </a:extLst>
+                  </pic:spPr>
+                </pic:pic>
+              </a:graphicData>
+            </a:graphic>
+          </wp:inline>
+        </w:drawing>
       </w:r>
     </w:p>
     <w:p>
-      <w:r>
-        <w:t xml:space="preserve">Full-duplex conversational behaviour on Jetson-class unified memory remains resource-constrained primarily by resident weights, KV cache, work arena, codec overhead, and the integrated Python stack. The in-tree Jetson policy already trades context length for safety, capping </w:t>
-      </w:r>
-      <w:proofErr w:type="spellStart"/>
-      <w:r>
-        <w:t>n_ctx</w:t>
-      </w:r>
-      <w:proofErr w:type="spellEnd"/>
-      <w:r>
-        <w:t xml:space="preserve"> at 1024 so that long voice-prompt prefills remain feasible without immediate OOM. Reducing </w:t>
-      </w:r>
-      <w:proofErr w:type="spellStart"/>
-      <w:r>
-        <w:t>dep_q</w:t>
-      </w:r>
-      <w:proofErr w:type="spellEnd"/>
-      <w:r>
-        <w:t xml:space="preserve"> from 16 to 8 codebook channels would alter model geometry relative to the trained </w:t>
-      </w:r>
-      <w:proofErr w:type="spellStart"/>
-      <w:r>
-        <w:t>PersonaPlex</w:t>
-      </w:r>
-      <w:proofErr w:type="spellEnd"/>
-      <w:r>
-        <w:t xml:space="preserve"> checkpoint and is not implemented as a runtime toggle; it should be treated as a research-level architectural change rather than the default mitigation for memory pressure. The preferred near-term levers are KV budget tuning, work-buffer sizing, and shorter </w:t>
+      <w:pPr>
+        <w:pStyle w:val="Caption"/>
+        <w:jc w:val="center"/>
+      </w:pPr>
+      <w:r>
+        <w:t xml:space="preserve">Figure </w:t>
+      </w:r>
+      <w:r>
+        <w:fldChar w:fldCharType="begin"/>
+      </w:r>
+      <w:r>
+        <w:instrText xml:space="preserve"> SEQ Figure \* ARABIC </w:instrText>
+      </w:r>
+      <w:r>
+        <w:fldChar w:fldCharType="separate"/>
+      </w:r>
+      <w:r>
+        <w:rPr>
+          <w:noProof/>
+        </w:rPr>
+        <w:t>7</w:t>
+      </w:r>
+      <w:r>
+        <w:fldChar w:fldCharType="end"/>
+      </w:r>
+      <w:r>
+        <w:t xml:space="preserve"> </w:t>
+      </w:r>
+      <w:r>
+        <w:t xml:space="preserve"> </w:t>
+      </w:r>
+      <w:r>
+        <w:rPr>
+          <w:b/>
+          <w:bCs/>
+        </w:rPr>
+        <w:t>Resident set size vs. usable RAM on Jetson Orin Nano 8 GB (25 W).</w:t>
+      </w:r>
+      <w:r>
+        <w:t xml:space="preserve"> Schematic RSS time series under the current pread + cudaHostRegister loader (not lazy weight mmap): (i) fully resident GGUF pools, (ii) FP16 temporal KV (n_ctx ≤ 1024), (iii) depth KV, (iv) fixed 1 GiB ggml work arena, (v) CUDA staging / registered buffers. Total residency exceeds the ~5.5 GB nominal usable ceiling, so the device additionally relies on a </w:t>
       </w:r>
       <w:r>
         <w:lastRenderedPageBreak/>
-        <w:t xml:space="preserve">prompts, with KV cache compression methods such as </w:t>
-      </w:r>
-      <w:proofErr w:type="spellStart"/>
-      <w:r>
-        <w:t>TurboQuant</w:t>
-      </w:r>
-      <w:proofErr w:type="spellEnd"/>
+        <w:t>configured 8 GiB swapfile plus zram-backed compressed swap to absorb the overshoot — explaining why the model loads and runs at the cost of paging-induced ~800 ms decode latency rather than OOM-killing.</w:t>
+      </w:r>
+    </w:p>
+    <w:p>
       <w:r>
         <w:t xml:space="preserve"> </w:t>
+      </w:r>
+      <w:r>
+        <w:t xml:space="preserve">Full-duplex conversational behaviour on Jetson-class unified memory remains resource-constrained primarily by resident weights, KV cache, work arena, codec overhead, and the integrated Python stack. The in-tree Jetson policy already trades context length for safety, capping n_ctx at 1024 so that long voice-prompt prefills remain feasible without immediate OOM. Reducing dep_q from 16 to 8 codebook channels would alter model geometry relative to the trained PersonaPlex checkpoint and is not implemented as a runtime toggle; it should be treated as a research-level architectural change rather than the default mitigation for memory pressure. The preferred near-term levers are KV budget tuning, work-buffer sizing, and shorter prompts, with KV cache compression methods such as TurboQuant </w:t>
       </w:r>
       <w:sdt>
         <w:sdtPr>
@@ -8144,63 +8698,13 @@
     </w:p>
     <w:p>
       <w:r>
-        <w:t xml:space="preserve">On the implementation side, the custom C++ and CUDA runtime and C ABI are now feature-complete for both temporal and depth forwards, with explicit memory accounting across weight pools, KV cache, fixed </w:t>
-      </w:r>
-      <w:proofErr w:type="spellStart"/>
-      <w:r>
-        <w:t>ggml</w:t>
-      </w:r>
-      <w:proofErr w:type="spellEnd"/>
-      <w:r>
-        <w:t xml:space="preserve"> work memory, and the Jetson </w:t>
-      </w:r>
-      <w:proofErr w:type="spellStart"/>
-      <w:r>
-        <w:t>n_ctx</w:t>
-      </w:r>
-      <w:proofErr w:type="spellEnd"/>
-      <w:r>
-        <w:t xml:space="preserve"> cap. The Python driver for hybrid inference has a stream mode aligned with </w:t>
-      </w:r>
-      <w:proofErr w:type="spellStart"/>
-      <w:r>
-        <w:t>moshi.offline</w:t>
-      </w:r>
-      <w:proofErr w:type="spellEnd"/>
-      <w:r>
-        <w:t xml:space="preserve"> and </w:t>
-      </w:r>
-      <w:proofErr w:type="spellStart"/>
-      <w:r>
-        <w:t>LMGen</w:t>
-      </w:r>
-      <w:proofErr w:type="spellEnd"/>
-      <w:r>
-        <w:t xml:space="preserve">, which is the supported path for bit-accurate delay and </w:t>
-      </w:r>
-      <w:proofErr w:type="spellStart"/>
-      <w:r>
-        <w:t>depformer</w:t>
-      </w:r>
-      <w:proofErr w:type="spellEnd"/>
-      <w:r>
-        <w:t xml:space="preserve"> behaviour relative to the reference stack. Remaining work is operational and scientific validation on target hardware: RSS profiling under real prompts, tuning the work-memory ceiling as graphs grow, and continued GGUF-versus-</w:t>
-      </w:r>
-      <w:proofErr w:type="spellStart"/>
-      <w:r>
-        <w:t>PyTorch</w:t>
-      </w:r>
-      <w:proofErr w:type="spellEnd"/>
-      <w:r>
-        <w:t xml:space="preserve"> quality checks. Longer-term directions include KV cache compression via </w:t>
-      </w:r>
-      <w:proofErr w:type="spellStart"/>
-      <w:r>
-        <w:t>TurboQuant</w:t>
-      </w:r>
-      <w:proofErr w:type="spellEnd"/>
-      <w:r>
-        <w:t xml:space="preserve">-class methods </w:t>
+        <w:t xml:space="preserve">On the implementation side, the custom C++ and CUDA runtime </w:t>
+      </w:r>
+      <w:r>
+        <w:t xml:space="preserve">are </w:t>
+      </w:r>
+      <w:r>
+        <w:t xml:space="preserve">now feature-complete for both temporal and depth forwards, with explicit memory accounting across weight pools, KV cache, fixed ggml work memory, and the Jetson n_ctx cap. The Python driver for hybrid inference has a stream mode aligned with moshi.offline and LMGen, which is the supported path for bit-accurate delay and depformer behaviour relative to the reference stack. Remaining work is operational and scientific validation on target hardware: RSS profiling under real prompts, tuning the work-memory ceiling as graphs grow, and continued GGUF-versus-PyTorch quality checks. Longer-term directions include KV cache compression via TurboQuant-class methods </w:t>
       </w:r>
       <w:sdt>
         <w:sdtPr>
@@ -8237,20 +8741,56 @@
     </w:p>
     <w:p>
       <w:r>
-        <w:t xml:space="preserve">Finally, the C++ implementation is still in development, with many critical bugs, synchronization issues, and memory bottlenecks already resolved </w:t>
-      </w:r>
-      <w:proofErr w:type="gramStart"/>
-      <w:r>
-        <w:t>during the course of</w:t>
-      </w:r>
-      <w:proofErr w:type="gramEnd"/>
-      <w:r>
-        <w:t xml:space="preserve"> writing this report. While full deployment and inferencing on the Jetson still requires further profiling, optimization, and long-duration stability validation, the current system demonstrates that a heavily compressed continuous speech-to-speech architecture can be executed with near-reference behaviour on constrained edge hardware. This establishes a strong foundation for future work in real-time embedded speech generation and low-memory neural inference systems.</w:t>
+        <w:t xml:space="preserve">Finally, the C++ implementation is still in development, with many critical bugs, synchronization issues, and memory bottlenecks already resolved during the course of writing this report. While full deployment and inferencing on the Jetson still requires further profiling, optimization, and long-duration stability validation, the current system demonstrates that a heavily compressed continuous speech-to-speech architecture can be executed with near-reference behaviour on constrained </w:t>
+      </w:r>
+      <w:r>
+        <w:lastRenderedPageBreak/>
+        <w:t>edge hardware. This establishes a strong foundation for future work in real-time embedded speech generation and low-memory neural inference systems.</w:t>
       </w:r>
     </w:p>
-    <w:p/>
-    <w:p/>
-    <w:p/>
+    <w:p>
+      <w:r>
+        <w:t xml:space="preserve">To validate the transcription output produced by Whisper, a demonstration web application was developed and hosted on the Jetson device. The interface can be accessed at: </w:t>
+      </w:r>
+      <w:hyperlink r:id="rId15" w:tgtFrame="_new" w:history="1">
+        <w:r>
+          <w:rPr>
+            <w:rStyle w:val="Hyperlink"/>
+          </w:rPr>
+          <w:t>https://bmo-project.co.uk/label/</w:t>
+        </w:r>
+      </w:hyperlink>
+      <w:r>
+        <w:t xml:space="preserve">. The complete source code for the project is available at: </w:t>
+      </w:r>
+      <w:hyperlink r:id="rId16" w:tgtFrame="_new" w:history="1">
+        <w:r>
+          <w:rPr>
+            <w:rStyle w:val="Hyperlink"/>
+          </w:rPr>
+          <w:t>https://github.com/utkarshyadav009/BMO-Project</w:t>
+        </w:r>
+      </w:hyperlink>
+      <w:r>
+        <w:t xml:space="preserve">, with the primary implementation discussed in this report contained within the </w:t>
+      </w:r>
+      <w:r>
+        <w:rPr>
+          <w:i/>
+          <w:iCs/>
+        </w:rPr>
+        <w:t>voice engine</w:t>
+      </w:r>
+      <w:r>
+        <w:t xml:space="preserve"> </w:t>
+      </w:r>
+      <w:r>
+        <w:t>folder</w:t>
+      </w:r>
+      <w:r>
+        <w:t>.</w:t>
+      </w:r>
+    </w:p>
     <w:sdt>
       <w:sdtPr>
         <w:rPr>
@@ -8330,7 +8870,6 @@
                 <w:rPr>
                   <w:noProof/>
                 </w:rPr>
-                <w:lastRenderedPageBreak/>
                 <w:t xml:space="preserve">Ashkboos, S. et al., 2024. </w:t>
               </w:r>
               <w:r>
@@ -8639,6 +9178,7 @@
                 <w:rPr>
                   <w:noProof/>
                 </w:rPr>
+                <w:lastRenderedPageBreak/>
                 <w:t xml:space="preserve">Wu, Y. et al., 2023. </w:t>
               </w:r>
               <w:r>
@@ -8693,11 +9233,33 @@
                 </w:rPr>
                 <w:fldChar w:fldCharType="end"/>
               </w:r>
+              <w:r>
+                <w:t xml:space="preserve"> </w:t>
+              </w:r>
+              <w:r>
+                <w:rPr>
+                  <w:noProof/>
+                </w:rPr>
+                <w:t xml:space="preserve">AI-assisted tools were used to proofread sections of this report and improve grammar, clarity, and overall writing flow. All technical content, analysis, and conclusions remain the </w:t>
+              </w:r>
+              <w:r>
+                <w:rPr>
+                  <w:noProof/>
+                </w:rPr>
+                <w:t xml:space="preserve">my own novel and orignal </w:t>
+              </w:r>
+              <w:r>
+                <w:rPr>
+                  <w:noProof/>
+                </w:rPr>
+                <w:t>work.</w:t>
+              </w:r>
             </w:p>
           </w:sdtContent>
         </w:sdt>
       </w:sdtContent>
     </w:sdt>
+    <w:p/>
     <w:p/>
     <w:p/>
     <w:p/>

</xml_diff>